<commit_message>
Mejora protocolo: encabezado en cuadricula, fichas con recuadros, quita Indicador y TENS, aclara que el QF solo ajusta horarios (dosis/medicamentos se sugieren al medico), agrega Evaluacion de resultados
</commit_message>
<xml_diff>
--- a/APF 1.5.1 Protocolo Atencion Farmaceutica domiciliaria PSCV.docx
+++ b/APF 1.5.1 Protocolo Atencion Farmaceutica domiciliaria PSCV.docx
@@ -867,7 +867,7 @@
                 <w:b w:val="0"/>
                 <w:sz w:val="22"/>
               </w:rPr>
-              <w:t>Planificar y ejecutar la visita domiciliaria, conducir la entrevista, realizar la conciliación, evaluar la adherencia, detectar y clasificar los PRM y RNM, proponer las intervenciones al médico tratante y registrar la atención en la ficha clínica. Supervisar el cumplimiento del protocolo.</w:t>
+              <w:t>Planificar y ejecutar la visita domiciliaria, conducir la entrevista, realizar la conciliación, evaluar la adherencia, educar al paciente y a su cuidador, y detectar y clasificar los PRM y RNM. Puede modificar directamente los horarios de toma de los medicamentos; cualquier otro cambio, de dosis o de medicamento, lo conversa con el médico o lo deja como sugerencia en la ficha clínica. Registra la atención y supervisa el cumplimiento del protocolo.</w:t>
             </w:r>
           </w:p>
         </w:tc>
@@ -925,45 +925,6 @@
                 <w:b w:val="0"/>
                 <w:sz w:val="22"/>
               </w:rPr>
-              <w:t>TENS Unidad de Farmacia</w:t>
-            </w:r>
-          </w:p>
-        </w:tc>
-        <w:tc>
-          <w:tcPr>
-            <w:tcW w:type="dxa" w:w="6236"/>
-            <w:vAlign w:val="center"/>
-          </w:tcPr>
-          <w:p>
-            <w:pPr>
-              <w:jc w:val="both"/>
-            </w:pPr>
-            <w:r/>
-            <w:r>
-              <w:rPr>
-                <w:rFonts w:ascii="Arial" w:hAnsi="Arial" w:cs="Arial"/>
-                <w:b w:val="0"/>
-                <w:sz w:val="22"/>
-              </w:rPr>
-              <w:t>Colaborar en el agendamiento de las visitas, en la preparación de los materiales y en la coordinación con el paciente y su cuidador.</w:t>
-            </w:r>
-          </w:p>
-        </w:tc>
-      </w:tr>
-      <w:tr>
-        <w:tc>
-          <w:tcPr>
-            <w:tcW w:type="dxa" w:w="2835"/>
-            <w:vAlign w:val="center"/>
-          </w:tcPr>
-          <w:p>
-            <w:r/>
-            <w:r>
-              <w:rPr>
-                <w:rFonts w:ascii="Arial" w:hAnsi="Arial" w:cs="Arial"/>
-                <w:b w:val="0"/>
-                <w:sz w:val="22"/>
-              </w:rPr>
               <w:t>Médico y equipo del Programa de Salud Cardiovascular</w:t>
             </w:r>
           </w:p>
@@ -984,7 +945,7 @@
                 <w:b w:val="0"/>
                 <w:sz w:val="22"/>
               </w:rPr>
-              <w:t>Derivar a los pacientes al protocolo, recibir las sugerencias del Químico Farmacéutico y resolver las interconsultas y los ajustes de tratamiento.</w:t>
+              <w:t>Derivar a los pacientes al protocolo, recibir las sugerencias del Químico Farmacéutico y resolver los ajustes de dosis o de tratamiento y las interconsultas.</w:t>
             </w:r>
           </w:p>
         </w:tc>
@@ -2087,7 +2048,7 @@
           <w:b w:val="0"/>
           <w:sz w:val="24"/>
         </w:rPr>
-        <w:t>Resuelve los RNM detectados y mejora los PRM, sugiriendo al médico tratante los ajustes del régimen terapéutico cuando se requiere, por ejemplo un cambio de dosis, de horario o de medicamento, o realizando un plan educativo cuando lo que se necesita es mejorar el conocimiento del paciente. Las medidas para resolver los PRM se detallan en el Anexo 7.</w:t>
+        <w:t>Aborda los PRM y RNM detectados según su tipo. El Químico Farmacéutico no realiza cambios de dosis ni de medicamentos por su cuenta; cuando el caso lo requiere, conversa la situación directamente con el médico tratante o deja la sugerencia registrada en la ficha clínica para que este la revise y dé su opinión. Lo que sí puede hacer de forma directa es ajustar los horarios de toma de los medicamentos y reforzar la educación. Las medidas y quién las ejecuta se detallan en el Anexo 7.</w:t>
       </w:r>
     </w:p>
     <w:p>
@@ -2129,7 +2090,7 @@
           <w:b w:val="0"/>
           <w:sz w:val="24"/>
         </w:rPr>
-        <w:t>Coordina con el equipo la interconsulta o la hora médica cuando el caso lo amerita, y da término a la entrevista indicando la fecha del próximo contacto.</w:t>
+        <w:t>Deja registrada en la ficha clínica cualquier sugerencia de ajuste para el médico y da término a la entrevista indicando la fecha del próximo contacto.</w:t>
       </w:r>
     </w:p>
     <w:p>
@@ -2469,7 +2430,34 @@
           <w:b w:val="0"/>
           <w:sz w:val="24"/>
         </w:rPr>
-        <w:t>Los problemas relacionados con los medicamentos y los resultados negativos asociados a la medicación se ordenan según sean de necesidad, efectividad o seguridad, siguiendo el Consenso de Granada (Anexo 6). Cada problema detectado se acompaña de una medida para resolverlo, recogida en el Anexo 7, dejando siempre la sugerencia registrada en la ficha clínica para el médico que corresponda. Las reacciones adversas se notifican según la Norma Técnica N.º 140 de Farmacovigilancia, utilizando el algoritmo de causalidad de la OMS.</w:t>
+        <w:t>Los problemas relacionados con los medicamentos y los resultados negativos asociados a la medicación se ordenan según sean de necesidad, efectividad o seguridad, siguiendo el Consenso de Granada (Anexo 6). Frente a un problema detectado, el Químico Farmacéutico puede ajustar directamente el horario de toma o reforzar la educación; en cambio, los cambios de dosis, el inicio o la suspensión de un medicamento y el cambio por otra alternativa no los realiza el farmacéutico, sino que los conversa con el médico o los deja como sugerencia en la ficha clínica para que este los revise y dé su opinión. Las medidas y quién las ejecuta se detallan en el Anexo 7. Las reacciones adversas se notifican según la Norma Técnica N.º 140 de Farmacovigilancia, utilizando el algoritmo de causalidad de la OMS.</w:t>
+      </w:r>
+    </w:p>
+    <w:p>
+      <w:pPr>
+        <w:keepNext/>
+        <w:spacing w:before="80"/>
+      </w:pPr>
+      <w:r>
+        <w:rPr>
+          <w:rFonts w:ascii="Arial" w:hAnsi="Arial" w:cs="Arial"/>
+          <w:b/>
+          <w:sz w:val="24"/>
+        </w:rPr>
+        <w:t>8.9 Evaluación de resultados</w:t>
+      </w:r>
+    </w:p>
+    <w:p>
+      <w:pPr>
+        <w:jc w:val="both"/>
+      </w:pPr>
+      <w:r>
+        <w:rPr>
+          <w:rFonts w:ascii="Arial" w:hAnsi="Arial" w:cs="Arial"/>
+          <w:b w:val="0"/>
+          <w:sz w:val="24"/>
+        </w:rPr>
+        <w:t>El Químico Farmacéutico analiza los resultados de las atenciones realizadas y los expone al equipo del Programa de Salud Cardiovascular, con el fin de definir estrategias de mejora. Cuando corresponde, remite un resumen de los resultados y de las estrategias a la Unidad de Farmacia del Servicio de Salud Concepción.</w:t>
       </w:r>
     </w:p>
     <w:p>
@@ -2483,63 +2471,7 @@
           <w:b/>
           <w:sz w:val="24"/>
         </w:rPr>
-        <w:t>9.- INDICADOR</w:t>
-      </w:r>
-    </w:p>
-    <w:p>
-      <w:pPr>
-        <w:pStyle w:val="ListBullet"/>
-        <w:jc w:val="both"/>
-      </w:pPr>
-      <w:r>
-        <w:rPr>
-          <w:rFonts w:ascii="Arial" w:hAnsi="Arial" w:cs="Arial"/>
-          <w:b w:val="0"/>
-          <w:sz w:val="24"/>
-        </w:rPr>
-        <w:t>Porcentaje de pacientes priorizados que completan el seguimiento farmacoterapéutico domiciliario (al menos tres visitas), calculado como el número de pacientes que completan el seguimiento sobre el número de pacientes ingresados al protocolo, multiplicado por cien.</w:t>
-      </w:r>
-    </w:p>
-    <w:p>
-      <w:pPr>
-        <w:pStyle w:val="ListBullet"/>
-        <w:jc w:val="both"/>
-      </w:pPr>
-      <w:r>
-        <w:rPr>
-          <w:rFonts w:ascii="Arial" w:hAnsi="Arial" w:cs="Arial"/>
-          <w:b w:val="0"/>
-          <w:sz w:val="24"/>
-        </w:rPr>
-        <w:t>Porcentaje de pacientes con PRM o RNM detectados en los que se realizó al menos una intervención farmacéutica.</w:t>
-      </w:r>
-    </w:p>
-    <w:p>
-      <w:pPr>
-        <w:pStyle w:val="ListBullet"/>
-        <w:jc w:val="both"/>
-      </w:pPr>
-      <w:r>
-        <w:rPr>
-          <w:rFonts w:ascii="Arial" w:hAnsi="Arial" w:cs="Arial"/>
-          <w:b w:val="0"/>
-          <w:sz w:val="24"/>
-        </w:rPr>
-        <w:t>El registro y la meta de los indicadores se encuentran en la carpeta de indicadores de la Unidad de Farmacia.</w:t>
-      </w:r>
-    </w:p>
-    <w:p>
-      <w:pPr>
-        <w:keepNext/>
-        <w:spacing w:before="200"/>
-      </w:pPr>
-      <w:r>
-        <w:rPr>
-          <w:rFonts w:ascii="Arial" w:hAnsi="Arial" w:cs="Arial"/>
-          <w:b/>
-          <w:sz w:val="24"/>
-        </w:rPr>
-        <w:t>10.- DISTRIBUCIÓN</w:t>
+        <w:t>9.- DISTRIBUCIÓN</w:t>
       </w:r>
     </w:p>
     <w:p>
@@ -2623,7 +2555,7 @@
           <w:b/>
           <w:sz w:val="24"/>
         </w:rPr>
-        <w:t>11.- BIBLIOGRAFÍA</w:t>
+        <w:t>10.- BIBLIOGRAFÍA</w:t>
       </w:r>
     </w:p>
     <w:p>
@@ -2782,7 +2714,7 @@
           <w:b/>
           <w:sz w:val="24"/>
         </w:rPr>
-        <w:t>12.- ANEXOS</w:t>
+        <w:t>11.- ANEXOS</w:t>
       </w:r>
     </w:p>
     <w:p>
@@ -2796,11 +2728,6 @@
           <w:sz w:val="24"/>
         </w:rPr>
         <w:t>Los anexos reúnen los instrumentos de apoyo que acompañan al protocolo. Son formatos de trabajo pensados para usarse durante la visita domiciliaria y el seguimiento, y pueden ajustarse a los registros propios del establecimiento.</w:t>
-      </w:r>
-    </w:p>
-    <w:p>
-      <w:r>
-        <w:br w:type="page"/>
       </w:r>
     </w:p>
     <w:p>
@@ -2831,74 +2758,118 @@
         <w:t>Permite comparar la medicación que el paciente tiene indicada con la que realmente usa, y dejar constancia de los cambios acordados con el equipo.</w:t>
       </w:r>
     </w:p>
-    <w:p>
-      <w:r>
-        <w:rPr>
-          <w:rFonts w:ascii="Arial" w:hAnsi="Arial" w:cs="Arial"/>
-          <w:b/>
-          <w:sz w:val="22"/>
-        </w:rPr>
-        <w:t xml:space="preserve">Nombre del paciente: </w:t>
-      </w:r>
-      <w:r>
-        <w:rPr>
-          <w:rFonts w:ascii="Arial" w:hAnsi="Arial" w:cs="Arial"/>
-          <w:b w:val="0"/>
-          <w:sz w:val="22"/>
-        </w:rPr>
-        <w:t>_____________________________________________</w:t>
-      </w:r>
-    </w:p>
-    <w:p>
-      <w:r>
-        <w:rPr>
-          <w:rFonts w:ascii="Arial" w:hAnsi="Arial" w:cs="Arial"/>
-          <w:b/>
-          <w:sz w:val="22"/>
-        </w:rPr>
-        <w:t xml:space="preserve">RUT: </w:t>
-      </w:r>
-      <w:r>
-        <w:rPr>
-          <w:rFonts w:ascii="Arial" w:hAnsi="Arial" w:cs="Arial"/>
-          <w:b w:val="0"/>
-          <w:sz w:val="22"/>
-        </w:rPr>
-        <w:t xml:space="preserve">____________________     </w:t>
-      </w:r>
-      <w:r>
-        <w:rPr>
-          <w:rFonts w:ascii="Arial" w:hAnsi="Arial" w:cs="Arial"/>
-          <w:b/>
-          <w:sz w:val="22"/>
-        </w:rPr>
-        <w:t xml:space="preserve">Sector: </w:t>
-      </w:r>
-      <w:r>
-        <w:rPr>
-          <w:rFonts w:ascii="Arial" w:hAnsi="Arial" w:cs="Arial"/>
-          <w:b w:val="0"/>
-          <w:sz w:val="22"/>
-        </w:rPr>
-        <w:t xml:space="preserve">_______________     </w:t>
-      </w:r>
-      <w:r>
-        <w:rPr>
-          <w:rFonts w:ascii="Arial" w:hAnsi="Arial" w:cs="Arial"/>
-          <w:b/>
-          <w:sz w:val="22"/>
-        </w:rPr>
-        <w:t xml:space="preserve">Fecha: </w:t>
-      </w:r>
-      <w:r>
-        <w:rPr>
-          <w:rFonts w:ascii="Arial" w:hAnsi="Arial" w:cs="Arial"/>
-          <w:b w:val="0"/>
-          <w:sz w:val="22"/>
-        </w:rPr>
-        <w:t>____________</w:t>
-      </w:r>
-    </w:p>
+    <w:tbl>
+      <w:tblPr>
+        <w:tblStyle w:val="TableGrid"/>
+        <w:tblW w:type="auto" w:w="0"/>
+        <w:jc w:val="center"/>
+        <w:tblLook w:firstColumn="1" w:firstRow="1" w:lastColumn="0" w:lastRow="0" w:noHBand="0" w:noVBand="1" w:val="04A0"/>
+      </w:tblPr>
+      <w:tblGrid>
+        <w:gridCol w:w="4703"/>
+        <w:gridCol w:w="4703"/>
+      </w:tblGrid>
+      <w:tr>
+        <w:tc>
+          <w:tcPr>
+            <w:tcW w:type="dxa" w:w="4703"/>
+          </w:tcPr>
+          <w:p>
+            <w:r/>
+            <w:r>
+              <w:rPr>
+                <w:rFonts w:ascii="Arial" w:hAnsi="Arial" w:cs="Arial"/>
+                <w:b/>
+                <w:sz w:val="20"/>
+              </w:rPr>
+              <w:t>Nombre del paciente:</w:t>
+            </w:r>
+            <w:r>
+              <w:rPr>
+                <w:rFonts w:ascii="Arial" w:hAnsi="Arial" w:cs="Arial"/>
+                <w:b w:val="0"/>
+                <w:sz w:val="20"/>
+              </w:rPr>
+              <w:t xml:space="preserve">  </w:t>
+            </w:r>
+          </w:p>
+        </w:tc>
+        <w:tc>
+          <w:tcPr>
+            <w:tcW w:type="dxa" w:w="4703"/>
+          </w:tcPr>
+          <w:p>
+            <w:r/>
+            <w:r>
+              <w:rPr>
+                <w:rFonts w:ascii="Arial" w:hAnsi="Arial" w:cs="Arial"/>
+                <w:b/>
+                <w:sz w:val="20"/>
+              </w:rPr>
+              <w:t>RUT:</w:t>
+            </w:r>
+            <w:r>
+              <w:rPr>
+                <w:rFonts w:ascii="Arial" w:hAnsi="Arial" w:cs="Arial"/>
+                <w:b w:val="0"/>
+                <w:sz w:val="20"/>
+              </w:rPr>
+              <w:t xml:space="preserve">  </w:t>
+            </w:r>
+          </w:p>
+        </w:tc>
+      </w:tr>
+      <w:tr>
+        <w:tc>
+          <w:tcPr>
+            <w:tcW w:type="dxa" w:w="4703"/>
+          </w:tcPr>
+          <w:p>
+            <w:r/>
+            <w:r>
+              <w:rPr>
+                <w:rFonts w:ascii="Arial" w:hAnsi="Arial" w:cs="Arial"/>
+                <w:b/>
+                <w:sz w:val="20"/>
+              </w:rPr>
+              <w:t>Sector:</w:t>
+            </w:r>
+            <w:r>
+              <w:rPr>
+                <w:rFonts w:ascii="Arial" w:hAnsi="Arial" w:cs="Arial"/>
+                <w:b w:val="0"/>
+                <w:sz w:val="20"/>
+              </w:rPr>
+              <w:t xml:space="preserve">  </w:t>
+            </w:r>
+          </w:p>
+        </w:tc>
+        <w:tc>
+          <w:tcPr>
+            <w:tcW w:type="dxa" w:w="4703"/>
+          </w:tcPr>
+          <w:p>
+            <w:r/>
+            <w:r>
+              <w:rPr>
+                <w:rFonts w:ascii="Arial" w:hAnsi="Arial" w:cs="Arial"/>
+                <w:b/>
+                <w:sz w:val="20"/>
+              </w:rPr>
+              <w:t>Fecha:</w:t>
+            </w:r>
+            <w:r>
+              <w:rPr>
+                <w:rFonts w:ascii="Arial" w:hAnsi="Arial" w:cs="Arial"/>
+                <w:b w:val="0"/>
+                <w:sz w:val="20"/>
+              </w:rPr>
+              <w:t xml:space="preserve">  </w:t>
+            </w:r>
+          </w:p>
+        </w:tc>
+      </w:tr>
+    </w:tbl>
     <w:p>
       <w:pPr>
         <w:keepNext/>
@@ -3007,72 +2978,6 @@
                 <w:sz w:val="20"/>
               </w:rPr>
               <w:t>Observaciones</w:t>
-            </w:r>
-          </w:p>
-        </w:tc>
-      </w:tr>
-      <w:tr>
-        <w:tc>
-          <w:tcPr>
-            <w:tcW w:type="dxa" w:w="2351"/>
-            <w:vAlign w:val="center"/>
-          </w:tcPr>
-          <w:p>
-            <w:r/>
-            <w:r>
-              <w:rPr>
-                <w:rFonts w:ascii="Arial" w:hAnsi="Arial" w:cs="Arial"/>
-                <w:b w:val="0"/>
-                <w:sz w:val="20"/>
-              </w:rPr>
-            </w:r>
-          </w:p>
-        </w:tc>
-        <w:tc>
-          <w:tcPr>
-            <w:tcW w:type="dxa" w:w="2351"/>
-            <w:vAlign w:val="center"/>
-          </w:tcPr>
-          <w:p>
-            <w:r/>
-            <w:r>
-              <w:rPr>
-                <w:rFonts w:ascii="Arial" w:hAnsi="Arial" w:cs="Arial"/>
-                <w:b w:val="0"/>
-                <w:sz w:val="20"/>
-              </w:rPr>
-            </w:r>
-          </w:p>
-        </w:tc>
-        <w:tc>
-          <w:tcPr>
-            <w:tcW w:type="dxa" w:w="2351"/>
-            <w:vAlign w:val="center"/>
-          </w:tcPr>
-          <w:p>
-            <w:r/>
-            <w:r>
-              <w:rPr>
-                <w:rFonts w:ascii="Arial" w:hAnsi="Arial" w:cs="Arial"/>
-                <w:b w:val="0"/>
-                <w:sz w:val="20"/>
-              </w:rPr>
-            </w:r>
-          </w:p>
-        </w:tc>
-        <w:tc>
-          <w:tcPr>
-            <w:tcW w:type="dxa" w:w="2351"/>
-            <w:vAlign w:val="center"/>
-          </w:tcPr>
-          <w:p>
-            <w:r/>
-            <w:r>
-              <w:rPr>
-                <w:rFonts w:ascii="Arial" w:hAnsi="Arial" w:cs="Arial"/>
-                <w:b w:val="0"/>
-                <w:sz w:val="20"/>
-              </w:rPr>
             </w:r>
           </w:p>
         </w:tc>
@@ -3714,56 +3619,6 @@
           </w:p>
         </w:tc>
       </w:tr>
-      <w:tr>
-        <w:tc>
-          <w:tcPr>
-            <w:tcW w:type="dxa" w:w="3135"/>
-            <w:vAlign w:val="center"/>
-          </w:tcPr>
-          <w:p>
-            <w:r/>
-            <w:r>
-              <w:rPr>
-                <w:rFonts w:ascii="Arial" w:hAnsi="Arial" w:cs="Arial"/>
-                <w:b w:val="0"/>
-                <w:sz w:val="20"/>
-              </w:rPr>
-            </w:r>
-          </w:p>
-        </w:tc>
-        <w:tc>
-          <w:tcPr>
-            <w:tcW w:type="dxa" w:w="3135"/>
-            <w:vAlign w:val="center"/>
-          </w:tcPr>
-          <w:p>
-            <w:r/>
-            <w:r>
-              <w:rPr>
-                <w:rFonts w:ascii="Arial" w:hAnsi="Arial" w:cs="Arial"/>
-                <w:b w:val="0"/>
-                <w:sz w:val="20"/>
-              </w:rPr>
-            </w:r>
-          </w:p>
-        </w:tc>
-        <w:tc>
-          <w:tcPr>
-            <w:tcW w:type="dxa" w:w="3135"/>
-            <w:vAlign w:val="center"/>
-          </w:tcPr>
-          <w:p>
-            <w:r/>
-            <w:r>
-              <w:rPr>
-                <w:rFonts w:ascii="Arial" w:hAnsi="Arial" w:cs="Arial"/>
-                <w:b w:val="0"/>
-                <w:sz w:val="20"/>
-              </w:rPr>
-            </w:r>
-          </w:p>
-        </w:tc>
-      </w:tr>
     </w:tbl>
     <w:p>
       <w:pPr>
@@ -3887,40 +3742,68 @@
         <w:t>Anexo 2. Test de adherencia de Morisky-Green-Levine</w:t>
       </w:r>
     </w:p>
-    <w:p>
-      <w:r>
-        <w:rPr>
-          <w:rFonts w:ascii="Arial" w:hAnsi="Arial" w:cs="Arial"/>
-          <w:b/>
-          <w:sz w:val="22"/>
-        </w:rPr>
-        <w:t xml:space="preserve">Nombre del paciente: </w:t>
-      </w:r>
-      <w:r>
-        <w:rPr>
-          <w:rFonts w:ascii="Arial" w:hAnsi="Arial" w:cs="Arial"/>
-          <w:b w:val="0"/>
-          <w:sz w:val="22"/>
-        </w:rPr>
-        <w:t xml:space="preserve">___________________________________   </w:t>
-      </w:r>
-      <w:r>
-        <w:rPr>
-          <w:rFonts w:ascii="Arial" w:hAnsi="Arial" w:cs="Arial"/>
-          <w:b/>
-          <w:sz w:val="22"/>
-        </w:rPr>
-        <w:t xml:space="preserve">Fecha: </w:t>
-      </w:r>
-      <w:r>
-        <w:rPr>
-          <w:rFonts w:ascii="Arial" w:hAnsi="Arial" w:cs="Arial"/>
-          <w:b w:val="0"/>
-          <w:sz w:val="22"/>
-        </w:rPr>
-        <w:t>____________</w:t>
-      </w:r>
-    </w:p>
+    <w:tbl>
+      <w:tblPr>
+        <w:tblStyle w:val="TableGrid"/>
+        <w:tblW w:type="auto" w:w="0"/>
+        <w:jc w:val="center"/>
+        <w:tblLook w:firstColumn="1" w:firstRow="1" w:lastColumn="0" w:lastRow="0" w:noHBand="0" w:noVBand="1" w:val="04A0"/>
+      </w:tblPr>
+      <w:tblGrid>
+        <w:gridCol w:w="4703"/>
+        <w:gridCol w:w="4703"/>
+      </w:tblGrid>
+      <w:tr>
+        <w:tc>
+          <w:tcPr>
+            <w:tcW w:type="dxa" w:w="4703"/>
+          </w:tcPr>
+          <w:p>
+            <w:r/>
+            <w:r>
+              <w:rPr>
+                <w:rFonts w:ascii="Arial" w:hAnsi="Arial" w:cs="Arial"/>
+                <w:b/>
+                <w:sz w:val="20"/>
+              </w:rPr>
+              <w:t>Nombre del paciente:</w:t>
+            </w:r>
+            <w:r>
+              <w:rPr>
+                <w:rFonts w:ascii="Arial" w:hAnsi="Arial" w:cs="Arial"/>
+                <w:b w:val="0"/>
+                <w:sz w:val="20"/>
+              </w:rPr>
+              <w:t xml:space="preserve">  </w:t>
+            </w:r>
+          </w:p>
+        </w:tc>
+        <w:tc>
+          <w:tcPr>
+            <w:tcW w:type="dxa" w:w="4703"/>
+          </w:tcPr>
+          <w:p>
+            <w:r/>
+            <w:r>
+              <w:rPr>
+                <w:rFonts w:ascii="Arial" w:hAnsi="Arial" w:cs="Arial"/>
+                <w:b/>
+                <w:sz w:val="20"/>
+              </w:rPr>
+              <w:t>Fecha:</w:t>
+            </w:r>
+            <w:r>
+              <w:rPr>
+                <w:rFonts w:ascii="Arial" w:hAnsi="Arial" w:cs="Arial"/>
+                <w:b w:val="0"/>
+                <w:sz w:val="20"/>
+              </w:rPr>
+              <w:t xml:space="preserve">  </w:t>
+            </w:r>
+          </w:p>
+        </w:tc>
+      </w:tr>
+    </w:tbl>
     <w:p/>
     <w:tbl>
       <w:tblPr>
@@ -4409,122 +4292,218 @@
         <w:t>Anexo 3. Ficha de seguimiento farmacoterapéutico</w:t>
       </w:r>
     </w:p>
-    <w:p>
-      <w:r>
-        <w:rPr>
-          <w:rFonts w:ascii="Arial" w:hAnsi="Arial" w:cs="Arial"/>
-          <w:b/>
-          <w:sz w:val="22"/>
-        </w:rPr>
-        <w:t xml:space="preserve">Nombre: </w:t>
-      </w:r>
-      <w:r>
-        <w:rPr>
-          <w:rFonts w:ascii="Arial" w:hAnsi="Arial" w:cs="Arial"/>
-          <w:b w:val="0"/>
-          <w:sz w:val="22"/>
-        </w:rPr>
-        <w:t xml:space="preserve">________________________________  </w:t>
-      </w:r>
-      <w:r>
-        <w:rPr>
-          <w:rFonts w:ascii="Arial" w:hAnsi="Arial" w:cs="Arial"/>
-          <w:b/>
-          <w:sz w:val="22"/>
-        </w:rPr>
-        <w:t xml:space="preserve">RUT: </w:t>
-      </w:r>
-      <w:r>
-        <w:rPr>
-          <w:rFonts w:ascii="Arial" w:hAnsi="Arial" w:cs="Arial"/>
-          <w:b w:val="0"/>
-          <w:sz w:val="22"/>
-        </w:rPr>
-        <w:t xml:space="preserve">________________  </w:t>
-      </w:r>
-      <w:r>
-        <w:rPr>
-          <w:rFonts w:ascii="Arial" w:hAnsi="Arial" w:cs="Arial"/>
-          <w:b/>
-          <w:sz w:val="22"/>
-        </w:rPr>
-        <w:t xml:space="preserve">Edad: </w:t>
-      </w:r>
-      <w:r>
-        <w:rPr>
-          <w:rFonts w:ascii="Arial" w:hAnsi="Arial" w:cs="Arial"/>
-          <w:b w:val="0"/>
-          <w:sz w:val="22"/>
-        </w:rPr>
-        <w:t xml:space="preserve">_____  </w:t>
-      </w:r>
-      <w:r>
-        <w:rPr>
-          <w:rFonts w:ascii="Arial" w:hAnsi="Arial" w:cs="Arial"/>
-          <w:b/>
-          <w:sz w:val="22"/>
-        </w:rPr>
-        <w:t xml:space="preserve">Sexo: </w:t>
-      </w:r>
-      <w:r>
-        <w:rPr>
-          <w:rFonts w:ascii="Arial" w:hAnsi="Arial" w:cs="Arial"/>
-          <w:b w:val="0"/>
-          <w:sz w:val="22"/>
-        </w:rPr>
-        <w:t>_____</w:t>
-      </w:r>
-    </w:p>
-    <w:p>
-      <w:r>
-        <w:rPr>
-          <w:rFonts w:ascii="Arial" w:hAnsi="Arial" w:cs="Arial"/>
-          <w:b/>
-          <w:sz w:val="22"/>
-        </w:rPr>
-        <w:t xml:space="preserve">Sector: </w:t>
-      </w:r>
-      <w:r>
-        <w:rPr>
-          <w:rFonts w:ascii="Arial" w:hAnsi="Arial" w:cs="Arial"/>
-          <w:b w:val="0"/>
-          <w:sz w:val="22"/>
-        </w:rPr>
-        <w:t xml:space="preserve">__________________   </w:t>
-      </w:r>
-      <w:r>
-        <w:rPr>
-          <w:rFonts w:ascii="Arial" w:hAnsi="Arial" w:cs="Arial"/>
-          <w:b/>
-          <w:sz w:val="22"/>
-        </w:rPr>
-        <w:t xml:space="preserve">N.º de atención (1.ª / 2.ª / 3.ª): </w:t>
-      </w:r>
-      <w:r>
-        <w:rPr>
-          <w:rFonts w:ascii="Arial" w:hAnsi="Arial" w:cs="Arial"/>
-          <w:b w:val="0"/>
-          <w:sz w:val="22"/>
-        </w:rPr>
-        <w:t xml:space="preserve">_____  </w:t>
-      </w:r>
-      <w:r>
-        <w:rPr>
-          <w:rFonts w:ascii="Arial" w:hAnsi="Arial" w:cs="Arial"/>
-          <w:b/>
-          <w:sz w:val="22"/>
-        </w:rPr>
-        <w:t xml:space="preserve">Fecha: </w:t>
-      </w:r>
-      <w:r>
-        <w:rPr>
-          <w:rFonts w:ascii="Arial" w:hAnsi="Arial" w:cs="Arial"/>
-          <w:b w:val="0"/>
-          <w:sz w:val="22"/>
-        </w:rPr>
-        <w:t>____________</w:t>
-      </w:r>
-    </w:p>
+    <w:tbl>
+      <w:tblPr>
+        <w:tblStyle w:val="TableGrid"/>
+        <w:tblW w:type="auto" w:w="0"/>
+        <w:jc w:val="center"/>
+        <w:tblLook w:firstColumn="1" w:firstRow="1" w:lastColumn="0" w:lastRow="0" w:noHBand="0" w:noVBand="1" w:val="04A0"/>
+      </w:tblPr>
+      <w:tblGrid>
+        <w:gridCol w:w="4703"/>
+        <w:gridCol w:w="4703"/>
+      </w:tblGrid>
+      <w:tr>
+        <w:tc>
+          <w:tcPr>
+            <w:tcW w:type="dxa" w:w="4703"/>
+          </w:tcPr>
+          <w:p>
+            <w:r/>
+            <w:r>
+              <w:rPr>
+                <w:rFonts w:ascii="Arial" w:hAnsi="Arial" w:cs="Arial"/>
+                <w:b/>
+                <w:sz w:val="20"/>
+              </w:rPr>
+              <w:t>Nombre:</w:t>
+            </w:r>
+            <w:r>
+              <w:rPr>
+                <w:rFonts w:ascii="Arial" w:hAnsi="Arial" w:cs="Arial"/>
+                <w:b w:val="0"/>
+                <w:sz w:val="20"/>
+              </w:rPr>
+              <w:t xml:space="preserve">  </w:t>
+            </w:r>
+          </w:p>
+        </w:tc>
+        <w:tc>
+          <w:tcPr>
+            <w:tcW w:type="dxa" w:w="4703"/>
+          </w:tcPr>
+          <w:p>
+            <w:r/>
+            <w:r>
+              <w:rPr>
+                <w:rFonts w:ascii="Arial" w:hAnsi="Arial" w:cs="Arial"/>
+                <w:b/>
+                <w:sz w:val="20"/>
+              </w:rPr>
+              <w:t>RUT:</w:t>
+            </w:r>
+            <w:r>
+              <w:rPr>
+                <w:rFonts w:ascii="Arial" w:hAnsi="Arial" w:cs="Arial"/>
+                <w:b w:val="0"/>
+                <w:sz w:val="20"/>
+              </w:rPr>
+              <w:t xml:space="preserve">  </w:t>
+            </w:r>
+          </w:p>
+        </w:tc>
+      </w:tr>
+      <w:tr>
+        <w:tc>
+          <w:tcPr>
+            <w:tcW w:type="dxa" w:w="4703"/>
+          </w:tcPr>
+          <w:p>
+            <w:r/>
+            <w:r>
+              <w:rPr>
+                <w:rFonts w:ascii="Arial" w:hAnsi="Arial" w:cs="Arial"/>
+                <w:b/>
+                <w:sz w:val="20"/>
+              </w:rPr>
+              <w:t>Edad:</w:t>
+            </w:r>
+            <w:r>
+              <w:rPr>
+                <w:rFonts w:ascii="Arial" w:hAnsi="Arial" w:cs="Arial"/>
+                <w:b w:val="0"/>
+                <w:sz w:val="20"/>
+              </w:rPr>
+              <w:t xml:space="preserve">  </w:t>
+            </w:r>
+          </w:p>
+        </w:tc>
+        <w:tc>
+          <w:tcPr>
+            <w:tcW w:type="dxa" w:w="4703"/>
+          </w:tcPr>
+          <w:p>
+            <w:r/>
+            <w:r>
+              <w:rPr>
+                <w:rFonts w:ascii="Arial" w:hAnsi="Arial" w:cs="Arial"/>
+                <w:b/>
+                <w:sz w:val="20"/>
+              </w:rPr>
+              <w:t>Sexo:</w:t>
+            </w:r>
+            <w:r>
+              <w:rPr>
+                <w:rFonts w:ascii="Arial" w:hAnsi="Arial" w:cs="Arial"/>
+                <w:b w:val="0"/>
+                <w:sz w:val="20"/>
+              </w:rPr>
+              <w:t xml:space="preserve">  </w:t>
+            </w:r>
+          </w:p>
+        </w:tc>
+      </w:tr>
+      <w:tr>
+        <w:tc>
+          <w:tcPr>
+            <w:tcW w:type="dxa" w:w="4703"/>
+          </w:tcPr>
+          <w:p>
+            <w:r/>
+            <w:r>
+              <w:rPr>
+                <w:rFonts w:ascii="Arial" w:hAnsi="Arial" w:cs="Arial"/>
+                <w:b/>
+                <w:sz w:val="20"/>
+              </w:rPr>
+              <w:t>Sector:</w:t>
+            </w:r>
+            <w:r>
+              <w:rPr>
+                <w:rFonts w:ascii="Arial" w:hAnsi="Arial" w:cs="Arial"/>
+                <w:b w:val="0"/>
+                <w:sz w:val="20"/>
+              </w:rPr>
+              <w:t xml:space="preserve">  </w:t>
+            </w:r>
+          </w:p>
+        </w:tc>
+        <w:tc>
+          <w:tcPr>
+            <w:tcW w:type="dxa" w:w="4703"/>
+          </w:tcPr>
+          <w:p>
+            <w:r/>
+            <w:r>
+              <w:rPr>
+                <w:rFonts w:ascii="Arial" w:hAnsi="Arial" w:cs="Arial"/>
+                <w:b/>
+                <w:sz w:val="20"/>
+              </w:rPr>
+              <w:t>N.º de atención (1.ª / 2.ª / 3.ª):</w:t>
+            </w:r>
+            <w:r>
+              <w:rPr>
+                <w:rFonts w:ascii="Arial" w:hAnsi="Arial" w:cs="Arial"/>
+                <w:b w:val="0"/>
+                <w:sz w:val="20"/>
+              </w:rPr>
+              <w:t xml:space="preserve">  </w:t>
+            </w:r>
+          </w:p>
+        </w:tc>
+      </w:tr>
+      <w:tr>
+        <w:tc>
+          <w:tcPr>
+            <w:tcW w:type="dxa" w:w="4703"/>
+          </w:tcPr>
+          <w:p>
+            <w:r/>
+            <w:r>
+              <w:rPr>
+                <w:rFonts w:ascii="Arial" w:hAnsi="Arial" w:cs="Arial"/>
+                <w:b/>
+                <w:sz w:val="20"/>
+              </w:rPr>
+              <w:t>Fecha:</w:t>
+            </w:r>
+            <w:r>
+              <w:rPr>
+                <w:rFonts w:ascii="Arial" w:hAnsi="Arial" w:cs="Arial"/>
+                <w:b w:val="0"/>
+                <w:sz w:val="20"/>
+              </w:rPr>
+              <w:t xml:space="preserve">  </w:t>
+            </w:r>
+          </w:p>
+        </w:tc>
+        <w:tc>
+          <w:tcPr>
+            <w:tcW w:type="dxa" w:w="4703"/>
+          </w:tcPr>
+          <w:p>
+            <w:r/>
+            <w:r>
+              <w:rPr>
+                <w:rFonts w:ascii="Arial" w:hAnsi="Arial" w:cs="Arial"/>
+                <w:b/>
+                <w:sz w:val="20"/>
+              </w:rPr>
+              <w:t>Teléfono de contacto:</w:t>
+            </w:r>
+            <w:r>
+              <w:rPr>
+                <w:rFonts w:ascii="Arial" w:hAnsi="Arial" w:cs="Arial"/>
+                <w:b w:val="0"/>
+                <w:sz w:val="20"/>
+              </w:rPr>
+              <w:t xml:space="preserve">  </w:t>
+            </w:r>
+          </w:p>
+        </w:tc>
+      </w:tr>
+    </w:tbl>
     <w:p>
       <w:pPr>
         <w:keepNext/>
@@ -4539,26 +4518,29 @@
         <w:t>Problemas de salud y antecedentes clínicos relevantes</w:t>
       </w:r>
     </w:p>
-    <w:p>
-      <w:r>
-        <w:rPr>
-          <w:rFonts w:ascii="Arial" w:hAnsi="Arial" w:cs="Arial"/>
-          <w:b w:val="0"/>
-          <w:sz w:val="22"/>
-        </w:rPr>
-        <w:t>____________________________________________________________________________________________</w:t>
-      </w:r>
-    </w:p>
-    <w:p>
-      <w:r>
-        <w:rPr>
-          <w:rFonts w:ascii="Arial" w:hAnsi="Arial" w:cs="Arial"/>
-          <w:b w:val="0"/>
-          <w:sz w:val="22"/>
-        </w:rPr>
-        <w:t>____________________________________________________________________________________________</w:t>
-      </w:r>
-    </w:p>
+    <w:tbl>
+      <w:tblPr>
+        <w:tblStyle w:val="TableGrid"/>
+        <w:tblW w:type="auto" w:w="0"/>
+        <w:jc w:val="center"/>
+        <w:tblLook w:firstColumn="1" w:firstRow="1" w:lastColumn="0" w:lastRow="0" w:noHBand="0" w:noVBand="1" w:val="04A0"/>
+      </w:tblPr>
+      <w:tblGrid>
+        <w:gridCol w:w="9406"/>
+      </w:tblGrid>
+      <w:tr>
+        <w:tc>
+          <w:tcPr>
+            <w:tcW w:type="dxa" w:w="9406"/>
+          </w:tcPr>
+          <w:p>
+            <w:r/>
+          </w:p>
+          <w:p/>
+          <w:p/>
+        </w:tc>
+      </w:tr>
+    </w:tbl>
     <w:p>
       <w:pPr>
         <w:keepNext/>
@@ -5355,26 +5337,29 @@
         <w:t>PRM y RNM detectados (con su clasificación)</w:t>
       </w:r>
     </w:p>
-    <w:p>
-      <w:r>
-        <w:rPr>
-          <w:rFonts w:ascii="Arial" w:hAnsi="Arial" w:cs="Arial"/>
-          <w:b w:val="0"/>
-          <w:sz w:val="22"/>
-        </w:rPr>
-        <w:t>____________________________________________________________________________________________</w:t>
-      </w:r>
-    </w:p>
-    <w:p>
-      <w:r>
-        <w:rPr>
-          <w:rFonts w:ascii="Arial" w:hAnsi="Arial" w:cs="Arial"/>
-          <w:b w:val="0"/>
-          <w:sz w:val="22"/>
-        </w:rPr>
-        <w:t>____________________________________________________________________________________________</w:t>
-      </w:r>
-    </w:p>
+    <w:tbl>
+      <w:tblPr>
+        <w:tblStyle w:val="TableGrid"/>
+        <w:tblW w:type="auto" w:w="0"/>
+        <w:jc w:val="center"/>
+        <w:tblLook w:firstColumn="1" w:firstRow="1" w:lastColumn="0" w:lastRow="0" w:noHBand="0" w:noVBand="1" w:val="04A0"/>
+      </w:tblPr>
+      <w:tblGrid>
+        <w:gridCol w:w="9406"/>
+      </w:tblGrid>
+      <w:tr>
+        <w:tc>
+          <w:tcPr>
+            <w:tcW w:type="dxa" w:w="9406"/>
+          </w:tcPr>
+          <w:p>
+            <w:r/>
+          </w:p>
+          <w:p/>
+          <w:p/>
+        </w:tc>
+      </w:tr>
+    </w:tbl>
     <w:p>
       <w:pPr>
         <w:keepNext/>
@@ -5389,26 +5374,29 @@
         <w:t>Intervenciones realizadas y resultado (aceptada / no aceptada)</w:t>
       </w:r>
     </w:p>
-    <w:p>
-      <w:r>
-        <w:rPr>
-          <w:rFonts w:ascii="Arial" w:hAnsi="Arial" w:cs="Arial"/>
-          <w:b w:val="0"/>
-          <w:sz w:val="22"/>
-        </w:rPr>
-        <w:t>____________________________________________________________________________________________</w:t>
-      </w:r>
-    </w:p>
-    <w:p>
-      <w:r>
-        <w:rPr>
-          <w:rFonts w:ascii="Arial" w:hAnsi="Arial" w:cs="Arial"/>
-          <w:b w:val="0"/>
-          <w:sz w:val="22"/>
-        </w:rPr>
-        <w:t>____________________________________________________________________________________________</w:t>
-      </w:r>
-    </w:p>
+    <w:tbl>
+      <w:tblPr>
+        <w:tblStyle w:val="TableGrid"/>
+        <w:tblW w:type="auto" w:w="0"/>
+        <w:jc w:val="center"/>
+        <w:tblLook w:firstColumn="1" w:firstRow="1" w:lastColumn="0" w:lastRow="0" w:noHBand="0" w:noVBand="1" w:val="04A0"/>
+      </w:tblPr>
+      <w:tblGrid>
+        <w:gridCol w:w="9406"/>
+      </w:tblGrid>
+      <w:tr>
+        <w:tc>
+          <w:tcPr>
+            <w:tcW w:type="dxa" w:w="9406"/>
+          </w:tcPr>
+          <w:p>
+            <w:r/>
+          </w:p>
+          <w:p/>
+          <w:p/>
+        </w:tc>
+      </w:tr>
+    </w:tbl>
     <w:p>
       <w:pPr>
         <w:keepNext/>
@@ -5420,29 +5408,32 @@
           <w:b/>
           <w:sz w:val="22"/>
         </w:rPr>
-        <w:t>Derivaciones y acuerdos con el médico u otros profesionales</w:t>
+        <w:t>Sugerencias dejadas al médico en la ficha clínica</w:t>
       </w:r>
     </w:p>
-    <w:p>
-      <w:r>
-        <w:rPr>
-          <w:rFonts w:ascii="Arial" w:hAnsi="Arial" w:cs="Arial"/>
-          <w:b w:val="0"/>
-          <w:sz w:val="22"/>
-        </w:rPr>
-        <w:t>____________________________________________________________________________________________</w:t>
-      </w:r>
-    </w:p>
-    <w:p>
-      <w:r>
-        <w:rPr>
-          <w:rFonts w:ascii="Arial" w:hAnsi="Arial" w:cs="Arial"/>
-          <w:b w:val="0"/>
-          <w:sz w:val="22"/>
-        </w:rPr>
-        <w:t>____________________________________________________________________________________________</w:t>
-      </w:r>
-    </w:p>
+    <w:tbl>
+      <w:tblPr>
+        <w:tblStyle w:val="TableGrid"/>
+        <w:tblW w:type="auto" w:w="0"/>
+        <w:jc w:val="center"/>
+        <w:tblLook w:firstColumn="1" w:firstRow="1" w:lastColumn="0" w:lastRow="0" w:noHBand="0" w:noVBand="1" w:val="04A0"/>
+      </w:tblPr>
+      <w:tblGrid>
+        <w:gridCol w:w="9406"/>
+      </w:tblGrid>
+      <w:tr>
+        <w:tc>
+          <w:tcPr>
+            <w:tcW w:type="dxa" w:w="9406"/>
+          </w:tcPr>
+          <w:p>
+            <w:r/>
+          </w:p>
+          <w:p/>
+          <w:p/>
+        </w:tc>
+      </w:tr>
+    </w:tbl>
     <w:p>
       <w:pPr>
         <w:sectPr>
@@ -5524,25 +5515,27 @@
         <w:tblStyle w:val="TableGrid"/>
         <w:tblW w:type="auto" w:w="0"/>
         <w:jc w:val="center"/>
+        <w:tblLayout w:type="fixed"/>
         <w:tblLook w:firstColumn="1" w:firstRow="1" w:lastColumn="0" w:lastRow="0" w:noHBand="0" w:noVBand="1" w:val="04A0"/>
+        <w:tblLayout w:type="fixed"/>
       </w:tblPr>
       <w:tblGrid>
-        <w:gridCol w:w="1255"/>
-        <w:gridCol w:w="1255"/>
-        <w:gridCol w:w="1255"/>
-        <w:gridCol w:w="1255"/>
-        <w:gridCol w:w="1255"/>
-        <w:gridCol w:w="1255"/>
-        <w:gridCol w:w="1255"/>
-        <w:gridCol w:w="1255"/>
-        <w:gridCol w:w="1255"/>
-        <w:gridCol w:w="1255"/>
-        <w:gridCol w:w="1255"/>
+        <w:gridCol w:w="2268"/>
+        <w:gridCol w:w="1048"/>
+        <w:gridCol w:w="1048"/>
+        <w:gridCol w:w="1048"/>
+        <w:gridCol w:w="1048"/>
+        <w:gridCol w:w="1048"/>
+        <w:gridCol w:w="1048"/>
+        <w:gridCol w:w="1048"/>
+        <w:gridCol w:w="1048"/>
+        <w:gridCol w:w="1048"/>
+        <w:gridCol w:w="1530"/>
       </w:tblGrid>
       <w:tr>
         <w:tc>
           <w:tcPr>
-            <w:tcW w:type="dxa" w:w="2608"/>
+            <w:tcW w:type="dxa" w:w="2268"/>
             <w:vMerge w:val="restart"/>
             <w:vAlign w:val="center"/>
             <w:shd w:val="clear" w:color="auto" w:fill="D9D9D9"/>
@@ -5556,7 +5549,7 @@
               <w:rPr>
                 <w:rFonts w:ascii="Arial" w:hAnsi="Arial" w:cs="Arial"/>
                 <w:b/>
-                <w:sz w:val="22"/>
+                <w:sz w:val="20"/>
               </w:rPr>
               <w:t>Medicamento</w:t>
             </w:r>
@@ -5564,7 +5557,7 @@
         </w:tc>
         <w:tc>
           <w:tcPr>
-            <w:tcW w:type="dxa" w:w="3111"/>
+            <w:tcW w:type="dxa" w:w="3147"/>
             <w:gridSpan w:val="3"/>
             <w:vAlign w:val="center"/>
             <w:shd w:val="clear" w:color="auto" w:fill="EFEFEF"/>
@@ -5577,7 +5570,7 @@
             <w:r>
               <w:drawing>
                 <wp:inline xmlns:a="http://schemas.openxmlformats.org/drawingml/2006/main" xmlns:pic="http://schemas.openxmlformats.org/drawingml/2006/picture">
-                  <wp:extent cx="342000" cy="342000"/>
+                  <wp:extent cx="324000" cy="324000"/>
                   <wp:docPr id="6" name="Picture 6"/>
                   <wp:cNvGraphicFramePr>
                     <a:graphicFrameLocks noChangeAspect="1"/>
@@ -5598,7 +5591,7 @@
                         <pic:spPr>
                           <a:xfrm>
                             <a:off x="0" y="0"/>
-                            <a:ext cx="342000" cy="342000"/>
+                            <a:ext cx="324000" cy="324000"/>
                           </a:xfrm>
                           <a:prstGeom prst="rect"/>
                         </pic:spPr>
@@ -5617,7 +5610,7 @@
               <w:rPr>
                 <w:rFonts w:ascii="Arial" w:hAnsi="Arial" w:cs="Arial"/>
                 <w:b/>
-                <w:sz w:val="18"/>
+                <w:sz w:val="17"/>
               </w:rPr>
               <w:t>DESAYUNO</w:t>
             </w:r>
@@ -5625,7 +5618,7 @@
         </w:tc>
         <w:tc>
           <w:tcPr>
-            <w:tcW w:type="dxa" w:w="3111"/>
+            <w:tcW w:type="dxa" w:w="3147"/>
             <w:gridSpan w:val="3"/>
             <w:vAlign w:val="center"/>
             <w:shd w:val="clear" w:color="auto" w:fill="EFEFEF"/>
@@ -5638,7 +5631,7 @@
             <w:r>
               <w:drawing>
                 <wp:inline xmlns:a="http://schemas.openxmlformats.org/drawingml/2006/main" xmlns:pic="http://schemas.openxmlformats.org/drawingml/2006/picture">
-                  <wp:extent cx="342000" cy="342000"/>
+                  <wp:extent cx="324000" cy="324000"/>
                   <wp:docPr id="7" name="Picture 7"/>
                   <wp:cNvGraphicFramePr>
                     <a:graphicFrameLocks noChangeAspect="1"/>
@@ -5659,7 +5652,7 @@
                         <pic:spPr>
                           <a:xfrm>
                             <a:off x="0" y="0"/>
-                            <a:ext cx="342000" cy="342000"/>
+                            <a:ext cx="324000" cy="324000"/>
                           </a:xfrm>
                           <a:prstGeom prst="rect"/>
                         </pic:spPr>
@@ -5678,7 +5671,7 @@
               <w:rPr>
                 <w:rFonts w:ascii="Arial" w:hAnsi="Arial" w:cs="Arial"/>
                 <w:b/>
-                <w:sz w:val="18"/>
+                <w:sz w:val="17"/>
               </w:rPr>
               <w:t>ALMUERZO</w:t>
             </w:r>
@@ -5686,7 +5679,7 @@
         </w:tc>
         <w:tc>
           <w:tcPr>
-            <w:tcW w:type="dxa" w:w="3111"/>
+            <w:tcW w:type="dxa" w:w="3147"/>
             <w:gridSpan w:val="3"/>
             <w:vAlign w:val="center"/>
             <w:shd w:val="clear" w:color="auto" w:fill="EFEFEF"/>
@@ -5699,7 +5692,7 @@
             <w:r>
               <w:drawing>
                 <wp:inline xmlns:a="http://schemas.openxmlformats.org/drawingml/2006/main" xmlns:pic="http://schemas.openxmlformats.org/drawingml/2006/picture">
-                  <wp:extent cx="342000" cy="342000"/>
+                  <wp:extent cx="324000" cy="324000"/>
                   <wp:docPr id="8" name="Picture 8"/>
                   <wp:cNvGraphicFramePr>
                     <a:graphicFrameLocks noChangeAspect="1"/>
@@ -5720,7 +5713,7 @@
                         <pic:spPr>
                           <a:xfrm>
                             <a:off x="0" y="0"/>
-                            <a:ext cx="342000" cy="342000"/>
+                            <a:ext cx="324000" cy="324000"/>
                           </a:xfrm>
                           <a:prstGeom prst="rect"/>
                         </pic:spPr>
@@ -5739,7 +5732,7 @@
               <w:rPr>
                 <w:rFonts w:ascii="Arial" w:hAnsi="Arial" w:cs="Arial"/>
                 <w:b/>
-                <w:sz w:val="18"/>
+                <w:sz w:val="17"/>
               </w:rPr>
               <w:t>ONCE</w:t>
             </w:r>
@@ -5747,7 +5740,7 @@
         </w:tc>
         <w:tc>
           <w:tcPr>
-            <w:tcW w:type="dxa" w:w="1037"/>
+            <w:tcW w:type="dxa" w:w="1531"/>
             <w:vMerge w:val="restart"/>
             <w:vAlign w:val="center"/>
             <w:shd w:val="clear" w:color="auto" w:fill="EFEFEF"/>
@@ -5760,7 +5753,7 @@
             <w:r>
               <w:drawing>
                 <wp:inline xmlns:a="http://schemas.openxmlformats.org/drawingml/2006/main" xmlns:pic="http://schemas.openxmlformats.org/drawingml/2006/picture">
-                  <wp:extent cx="342000" cy="342000"/>
+                  <wp:extent cx="324000" cy="324000"/>
                   <wp:docPr id="9" name="Picture 9"/>
                   <wp:cNvGraphicFramePr>
                     <a:graphicFrameLocks noChangeAspect="1"/>
@@ -5781,7 +5774,7 @@
                         <pic:spPr>
                           <a:xfrm>
                             <a:off x="0" y="0"/>
-                            <a:ext cx="342000" cy="342000"/>
+                            <a:ext cx="324000" cy="324000"/>
                           </a:xfrm>
                           <a:prstGeom prst="rect"/>
                         </pic:spPr>
@@ -5800,7 +5793,7 @@
               <w:rPr>
                 <w:rFonts w:ascii="Arial" w:hAnsi="Arial" w:cs="Arial"/>
                 <w:b/>
-                <w:sz w:val="18"/>
+                <w:sz w:val="17"/>
               </w:rPr>
               <w:t>AL ACOSTARSE</w:t>
             </w:r>
@@ -5810,14 +5803,14 @@
       <w:tr>
         <w:tc>
           <w:tcPr>
-            <w:tcW w:type="dxa" w:w="2608"/>
+            <w:tcW w:type="dxa" w:w="2268"/>
             <w:vMerge/>
           </w:tcPr>
           <w:p/>
         </w:tc>
         <w:tc>
           <w:tcPr>
-            <w:tcW w:type="dxa" w:w="1037"/>
+            <w:tcW w:type="dxa" w:w="1049"/>
             <w:vAlign w:val="center"/>
             <w:shd w:val="clear" w:color="auto" w:fill="F5F5F5"/>
           </w:tcPr>
@@ -5838,7 +5831,7 @@
         </w:tc>
         <w:tc>
           <w:tcPr>
-            <w:tcW w:type="dxa" w:w="1037"/>
+            <w:tcW w:type="dxa" w:w="1049"/>
             <w:vAlign w:val="center"/>
             <w:shd w:val="clear" w:color="auto" w:fill="F5F5F5"/>
           </w:tcPr>
@@ -5859,7 +5852,7 @@
         </w:tc>
         <w:tc>
           <w:tcPr>
-            <w:tcW w:type="dxa" w:w="1037"/>
+            <w:tcW w:type="dxa" w:w="1049"/>
             <w:vAlign w:val="center"/>
             <w:shd w:val="clear" w:color="auto" w:fill="F5F5F5"/>
           </w:tcPr>
@@ -5880,7 +5873,7 @@
         </w:tc>
         <w:tc>
           <w:tcPr>
-            <w:tcW w:type="dxa" w:w="1037"/>
+            <w:tcW w:type="dxa" w:w="1049"/>
             <w:vAlign w:val="center"/>
             <w:shd w:val="clear" w:color="auto" w:fill="F5F5F5"/>
           </w:tcPr>
@@ -5901,7 +5894,7 @@
         </w:tc>
         <w:tc>
           <w:tcPr>
-            <w:tcW w:type="dxa" w:w="1037"/>
+            <w:tcW w:type="dxa" w:w="1049"/>
             <w:vAlign w:val="center"/>
             <w:shd w:val="clear" w:color="auto" w:fill="F5F5F5"/>
           </w:tcPr>
@@ -5922,7 +5915,7 @@
         </w:tc>
         <w:tc>
           <w:tcPr>
-            <w:tcW w:type="dxa" w:w="1037"/>
+            <w:tcW w:type="dxa" w:w="1049"/>
             <w:vAlign w:val="center"/>
             <w:shd w:val="clear" w:color="auto" w:fill="F5F5F5"/>
           </w:tcPr>
@@ -5943,7 +5936,7 @@
         </w:tc>
         <w:tc>
           <w:tcPr>
-            <w:tcW w:type="dxa" w:w="1037"/>
+            <w:tcW w:type="dxa" w:w="1049"/>
             <w:vAlign w:val="center"/>
             <w:shd w:val="clear" w:color="auto" w:fill="F5F5F5"/>
           </w:tcPr>
@@ -5964,7 +5957,7 @@
         </w:tc>
         <w:tc>
           <w:tcPr>
-            <w:tcW w:type="dxa" w:w="1037"/>
+            <w:tcW w:type="dxa" w:w="1049"/>
             <w:vAlign w:val="center"/>
             <w:shd w:val="clear" w:color="auto" w:fill="F5F5F5"/>
           </w:tcPr>
@@ -5985,7 +5978,7 @@
         </w:tc>
         <w:tc>
           <w:tcPr>
-            <w:tcW w:type="dxa" w:w="1037"/>
+            <w:tcW w:type="dxa" w:w="1049"/>
             <w:vAlign w:val="center"/>
             <w:shd w:val="clear" w:color="auto" w:fill="F5F5F5"/>
           </w:tcPr>
@@ -6006,7 +5999,7 @@
         </w:tc>
         <w:tc>
           <w:tcPr>
-            <w:tcW w:type="dxa" w:w="1037"/>
+            <w:tcW w:type="dxa" w:w="1531"/>
             <w:vMerge/>
           </w:tcPr>
           <w:p/>
@@ -6018,7 +6011,7 @@
         </w:trPr>
         <w:tc>
           <w:tcPr>
-            <w:tcW w:type="dxa" w:w="2608"/>
+            <w:tcW w:type="dxa" w:w="2268"/>
             <w:vAlign w:val="center"/>
           </w:tcPr>
           <w:p>
@@ -6034,7 +6027,7 @@
         </w:tc>
         <w:tc>
           <w:tcPr>
-            <w:tcW w:type="dxa" w:w="1037"/>
+            <w:tcW w:type="dxa" w:w="1049"/>
             <w:vAlign w:val="center"/>
           </w:tcPr>
           <w:p>
@@ -6050,7 +6043,7 @@
         </w:tc>
         <w:tc>
           <w:tcPr>
-            <w:tcW w:type="dxa" w:w="1037"/>
+            <w:tcW w:type="dxa" w:w="1049"/>
             <w:vAlign w:val="center"/>
           </w:tcPr>
           <w:p>
@@ -6066,7 +6059,7 @@
         </w:tc>
         <w:tc>
           <w:tcPr>
-            <w:tcW w:type="dxa" w:w="1037"/>
+            <w:tcW w:type="dxa" w:w="1049"/>
             <w:vAlign w:val="center"/>
           </w:tcPr>
           <w:p>
@@ -6082,7 +6075,7 @@
         </w:tc>
         <w:tc>
           <w:tcPr>
-            <w:tcW w:type="dxa" w:w="1037"/>
+            <w:tcW w:type="dxa" w:w="1049"/>
             <w:vAlign w:val="center"/>
           </w:tcPr>
           <w:p>
@@ -6098,7 +6091,7 @@
         </w:tc>
         <w:tc>
           <w:tcPr>
-            <w:tcW w:type="dxa" w:w="1037"/>
+            <w:tcW w:type="dxa" w:w="1049"/>
             <w:vAlign w:val="center"/>
           </w:tcPr>
           <w:p>
@@ -6114,7 +6107,7 @@
         </w:tc>
         <w:tc>
           <w:tcPr>
-            <w:tcW w:type="dxa" w:w="1037"/>
+            <w:tcW w:type="dxa" w:w="1049"/>
             <w:vAlign w:val="center"/>
           </w:tcPr>
           <w:p>
@@ -6130,7 +6123,7 @@
         </w:tc>
         <w:tc>
           <w:tcPr>
-            <w:tcW w:type="dxa" w:w="1037"/>
+            <w:tcW w:type="dxa" w:w="1049"/>
             <w:vAlign w:val="center"/>
           </w:tcPr>
           <w:p>
@@ -6146,7 +6139,7 @@
         </w:tc>
         <w:tc>
           <w:tcPr>
-            <w:tcW w:type="dxa" w:w="1037"/>
+            <w:tcW w:type="dxa" w:w="1049"/>
             <w:vAlign w:val="center"/>
           </w:tcPr>
           <w:p>
@@ -6162,7 +6155,7 @@
         </w:tc>
         <w:tc>
           <w:tcPr>
-            <w:tcW w:type="dxa" w:w="1037"/>
+            <w:tcW w:type="dxa" w:w="1049"/>
             <w:vAlign w:val="center"/>
           </w:tcPr>
           <w:p>
@@ -6178,7 +6171,7 @@
         </w:tc>
         <w:tc>
           <w:tcPr>
-            <w:tcW w:type="dxa" w:w="1037"/>
+            <w:tcW w:type="dxa" w:w="1531"/>
             <w:vAlign w:val="center"/>
           </w:tcPr>
           <w:p>
@@ -6199,7 +6192,7 @@
         </w:trPr>
         <w:tc>
           <w:tcPr>
-            <w:tcW w:type="dxa" w:w="2608"/>
+            <w:tcW w:type="dxa" w:w="2268"/>
             <w:vAlign w:val="center"/>
           </w:tcPr>
           <w:p>
@@ -6215,7 +6208,7 @@
         </w:tc>
         <w:tc>
           <w:tcPr>
-            <w:tcW w:type="dxa" w:w="1037"/>
+            <w:tcW w:type="dxa" w:w="1049"/>
             <w:vAlign w:val="center"/>
           </w:tcPr>
           <w:p>
@@ -6231,7 +6224,7 @@
         </w:tc>
         <w:tc>
           <w:tcPr>
-            <w:tcW w:type="dxa" w:w="1037"/>
+            <w:tcW w:type="dxa" w:w="1049"/>
             <w:vAlign w:val="center"/>
           </w:tcPr>
           <w:p>
@@ -6247,7 +6240,7 @@
         </w:tc>
         <w:tc>
           <w:tcPr>
-            <w:tcW w:type="dxa" w:w="1037"/>
+            <w:tcW w:type="dxa" w:w="1049"/>
             <w:vAlign w:val="center"/>
           </w:tcPr>
           <w:p>
@@ -6263,7 +6256,7 @@
         </w:tc>
         <w:tc>
           <w:tcPr>
-            <w:tcW w:type="dxa" w:w="1037"/>
+            <w:tcW w:type="dxa" w:w="1049"/>
             <w:vAlign w:val="center"/>
           </w:tcPr>
           <w:p>
@@ -6279,7 +6272,7 @@
         </w:tc>
         <w:tc>
           <w:tcPr>
-            <w:tcW w:type="dxa" w:w="1037"/>
+            <w:tcW w:type="dxa" w:w="1049"/>
             <w:vAlign w:val="center"/>
           </w:tcPr>
           <w:p>
@@ -6295,7 +6288,7 @@
         </w:tc>
         <w:tc>
           <w:tcPr>
-            <w:tcW w:type="dxa" w:w="1037"/>
+            <w:tcW w:type="dxa" w:w="1049"/>
             <w:vAlign w:val="center"/>
           </w:tcPr>
           <w:p>
@@ -6311,7 +6304,7 @@
         </w:tc>
         <w:tc>
           <w:tcPr>
-            <w:tcW w:type="dxa" w:w="1037"/>
+            <w:tcW w:type="dxa" w:w="1049"/>
             <w:vAlign w:val="center"/>
           </w:tcPr>
           <w:p>
@@ -6327,7 +6320,7 @@
         </w:tc>
         <w:tc>
           <w:tcPr>
-            <w:tcW w:type="dxa" w:w="1037"/>
+            <w:tcW w:type="dxa" w:w="1049"/>
             <w:vAlign w:val="center"/>
           </w:tcPr>
           <w:p>
@@ -6343,7 +6336,7 @@
         </w:tc>
         <w:tc>
           <w:tcPr>
-            <w:tcW w:type="dxa" w:w="1037"/>
+            <w:tcW w:type="dxa" w:w="1049"/>
             <w:vAlign w:val="center"/>
           </w:tcPr>
           <w:p>
@@ -6359,7 +6352,7 @@
         </w:tc>
         <w:tc>
           <w:tcPr>
-            <w:tcW w:type="dxa" w:w="1037"/>
+            <w:tcW w:type="dxa" w:w="1531"/>
             <w:vAlign w:val="center"/>
           </w:tcPr>
           <w:p>
@@ -6380,7 +6373,7 @@
         </w:trPr>
         <w:tc>
           <w:tcPr>
-            <w:tcW w:type="dxa" w:w="2608"/>
+            <w:tcW w:type="dxa" w:w="2268"/>
             <w:vAlign w:val="center"/>
           </w:tcPr>
           <w:p>
@@ -6396,7 +6389,7 @@
         </w:tc>
         <w:tc>
           <w:tcPr>
-            <w:tcW w:type="dxa" w:w="1037"/>
+            <w:tcW w:type="dxa" w:w="1049"/>
             <w:vAlign w:val="center"/>
           </w:tcPr>
           <w:p>
@@ -6412,7 +6405,7 @@
         </w:tc>
         <w:tc>
           <w:tcPr>
-            <w:tcW w:type="dxa" w:w="1037"/>
+            <w:tcW w:type="dxa" w:w="1049"/>
             <w:vAlign w:val="center"/>
           </w:tcPr>
           <w:p>
@@ -6428,7 +6421,7 @@
         </w:tc>
         <w:tc>
           <w:tcPr>
-            <w:tcW w:type="dxa" w:w="1037"/>
+            <w:tcW w:type="dxa" w:w="1049"/>
             <w:vAlign w:val="center"/>
           </w:tcPr>
           <w:p>
@@ -6444,7 +6437,7 @@
         </w:tc>
         <w:tc>
           <w:tcPr>
-            <w:tcW w:type="dxa" w:w="1037"/>
+            <w:tcW w:type="dxa" w:w="1049"/>
             <w:vAlign w:val="center"/>
           </w:tcPr>
           <w:p>
@@ -6460,7 +6453,7 @@
         </w:tc>
         <w:tc>
           <w:tcPr>
-            <w:tcW w:type="dxa" w:w="1037"/>
+            <w:tcW w:type="dxa" w:w="1049"/>
             <w:vAlign w:val="center"/>
           </w:tcPr>
           <w:p>
@@ -6476,7 +6469,7 @@
         </w:tc>
         <w:tc>
           <w:tcPr>
-            <w:tcW w:type="dxa" w:w="1037"/>
+            <w:tcW w:type="dxa" w:w="1049"/>
             <w:vAlign w:val="center"/>
           </w:tcPr>
           <w:p>
@@ -6492,7 +6485,7 @@
         </w:tc>
         <w:tc>
           <w:tcPr>
-            <w:tcW w:type="dxa" w:w="1037"/>
+            <w:tcW w:type="dxa" w:w="1049"/>
             <w:vAlign w:val="center"/>
           </w:tcPr>
           <w:p>
@@ -6508,7 +6501,7 @@
         </w:tc>
         <w:tc>
           <w:tcPr>
-            <w:tcW w:type="dxa" w:w="1037"/>
+            <w:tcW w:type="dxa" w:w="1049"/>
             <w:vAlign w:val="center"/>
           </w:tcPr>
           <w:p>
@@ -6524,7 +6517,7 @@
         </w:tc>
         <w:tc>
           <w:tcPr>
-            <w:tcW w:type="dxa" w:w="1037"/>
+            <w:tcW w:type="dxa" w:w="1049"/>
             <w:vAlign w:val="center"/>
           </w:tcPr>
           <w:p>
@@ -6540,7 +6533,7 @@
         </w:tc>
         <w:tc>
           <w:tcPr>
-            <w:tcW w:type="dxa" w:w="1037"/>
+            <w:tcW w:type="dxa" w:w="1531"/>
             <w:vAlign w:val="center"/>
           </w:tcPr>
           <w:p>
@@ -6561,7 +6554,7 @@
         </w:trPr>
         <w:tc>
           <w:tcPr>
-            <w:tcW w:type="dxa" w:w="2608"/>
+            <w:tcW w:type="dxa" w:w="2268"/>
             <w:vAlign w:val="center"/>
           </w:tcPr>
           <w:p>
@@ -6577,7 +6570,7 @@
         </w:tc>
         <w:tc>
           <w:tcPr>
-            <w:tcW w:type="dxa" w:w="1037"/>
+            <w:tcW w:type="dxa" w:w="1049"/>
             <w:vAlign w:val="center"/>
           </w:tcPr>
           <w:p>
@@ -6593,7 +6586,7 @@
         </w:tc>
         <w:tc>
           <w:tcPr>
-            <w:tcW w:type="dxa" w:w="1037"/>
+            <w:tcW w:type="dxa" w:w="1049"/>
             <w:vAlign w:val="center"/>
           </w:tcPr>
           <w:p>
@@ -6609,7 +6602,7 @@
         </w:tc>
         <w:tc>
           <w:tcPr>
-            <w:tcW w:type="dxa" w:w="1037"/>
+            <w:tcW w:type="dxa" w:w="1049"/>
             <w:vAlign w:val="center"/>
           </w:tcPr>
           <w:p>
@@ -6625,7 +6618,7 @@
         </w:tc>
         <w:tc>
           <w:tcPr>
-            <w:tcW w:type="dxa" w:w="1037"/>
+            <w:tcW w:type="dxa" w:w="1049"/>
             <w:vAlign w:val="center"/>
           </w:tcPr>
           <w:p>
@@ -6641,7 +6634,7 @@
         </w:tc>
         <w:tc>
           <w:tcPr>
-            <w:tcW w:type="dxa" w:w="1037"/>
+            <w:tcW w:type="dxa" w:w="1049"/>
             <w:vAlign w:val="center"/>
           </w:tcPr>
           <w:p>
@@ -6657,7 +6650,7 @@
         </w:tc>
         <w:tc>
           <w:tcPr>
-            <w:tcW w:type="dxa" w:w="1037"/>
+            <w:tcW w:type="dxa" w:w="1049"/>
             <w:vAlign w:val="center"/>
           </w:tcPr>
           <w:p>
@@ -6673,7 +6666,7 @@
         </w:tc>
         <w:tc>
           <w:tcPr>
-            <w:tcW w:type="dxa" w:w="1037"/>
+            <w:tcW w:type="dxa" w:w="1049"/>
             <w:vAlign w:val="center"/>
           </w:tcPr>
           <w:p>
@@ -6689,7 +6682,7 @@
         </w:tc>
         <w:tc>
           <w:tcPr>
-            <w:tcW w:type="dxa" w:w="1037"/>
+            <w:tcW w:type="dxa" w:w="1049"/>
             <w:vAlign w:val="center"/>
           </w:tcPr>
           <w:p>
@@ -6705,7 +6698,7 @@
         </w:tc>
         <w:tc>
           <w:tcPr>
-            <w:tcW w:type="dxa" w:w="1037"/>
+            <w:tcW w:type="dxa" w:w="1049"/>
             <w:vAlign w:val="center"/>
           </w:tcPr>
           <w:p>
@@ -6721,7 +6714,7 @@
         </w:tc>
         <w:tc>
           <w:tcPr>
-            <w:tcW w:type="dxa" w:w="1037"/>
+            <w:tcW w:type="dxa" w:w="1531"/>
             <w:vAlign w:val="center"/>
           </w:tcPr>
           <w:p>
@@ -6742,7 +6735,7 @@
         </w:trPr>
         <w:tc>
           <w:tcPr>
-            <w:tcW w:type="dxa" w:w="2608"/>
+            <w:tcW w:type="dxa" w:w="2268"/>
             <w:vAlign w:val="center"/>
           </w:tcPr>
           <w:p>
@@ -6758,7 +6751,7 @@
         </w:tc>
         <w:tc>
           <w:tcPr>
-            <w:tcW w:type="dxa" w:w="1037"/>
+            <w:tcW w:type="dxa" w:w="1049"/>
             <w:vAlign w:val="center"/>
           </w:tcPr>
           <w:p>
@@ -6774,7 +6767,7 @@
         </w:tc>
         <w:tc>
           <w:tcPr>
-            <w:tcW w:type="dxa" w:w="1037"/>
+            <w:tcW w:type="dxa" w:w="1049"/>
             <w:vAlign w:val="center"/>
           </w:tcPr>
           <w:p>
@@ -6790,7 +6783,7 @@
         </w:tc>
         <w:tc>
           <w:tcPr>
-            <w:tcW w:type="dxa" w:w="1037"/>
+            <w:tcW w:type="dxa" w:w="1049"/>
             <w:vAlign w:val="center"/>
           </w:tcPr>
           <w:p>
@@ -6806,7 +6799,7 @@
         </w:tc>
         <w:tc>
           <w:tcPr>
-            <w:tcW w:type="dxa" w:w="1037"/>
+            <w:tcW w:type="dxa" w:w="1049"/>
             <w:vAlign w:val="center"/>
           </w:tcPr>
           <w:p>
@@ -6822,7 +6815,7 @@
         </w:tc>
         <w:tc>
           <w:tcPr>
-            <w:tcW w:type="dxa" w:w="1037"/>
+            <w:tcW w:type="dxa" w:w="1049"/>
             <w:vAlign w:val="center"/>
           </w:tcPr>
           <w:p>
@@ -6838,7 +6831,7 @@
         </w:tc>
         <w:tc>
           <w:tcPr>
-            <w:tcW w:type="dxa" w:w="1037"/>
+            <w:tcW w:type="dxa" w:w="1049"/>
             <w:vAlign w:val="center"/>
           </w:tcPr>
           <w:p>
@@ -6854,7 +6847,7 @@
         </w:tc>
         <w:tc>
           <w:tcPr>
-            <w:tcW w:type="dxa" w:w="1037"/>
+            <w:tcW w:type="dxa" w:w="1049"/>
             <w:vAlign w:val="center"/>
           </w:tcPr>
           <w:p>
@@ -6870,7 +6863,7 @@
         </w:tc>
         <w:tc>
           <w:tcPr>
-            <w:tcW w:type="dxa" w:w="1037"/>
+            <w:tcW w:type="dxa" w:w="1049"/>
             <w:vAlign w:val="center"/>
           </w:tcPr>
           <w:p>
@@ -6886,7 +6879,7 @@
         </w:tc>
         <w:tc>
           <w:tcPr>
-            <w:tcW w:type="dxa" w:w="1037"/>
+            <w:tcW w:type="dxa" w:w="1049"/>
             <w:vAlign w:val="center"/>
           </w:tcPr>
           <w:p>
@@ -6902,7 +6895,7 @@
         </w:tc>
         <w:tc>
           <w:tcPr>
-            <w:tcW w:type="dxa" w:w="1037"/>
+            <w:tcW w:type="dxa" w:w="1531"/>
             <w:vAlign w:val="center"/>
           </w:tcPr>
           <w:p>
@@ -6923,7 +6916,7 @@
         </w:trPr>
         <w:tc>
           <w:tcPr>
-            <w:tcW w:type="dxa" w:w="2608"/>
+            <w:tcW w:type="dxa" w:w="2268"/>
             <w:vAlign w:val="center"/>
           </w:tcPr>
           <w:p>
@@ -6939,7 +6932,7 @@
         </w:tc>
         <w:tc>
           <w:tcPr>
-            <w:tcW w:type="dxa" w:w="1037"/>
+            <w:tcW w:type="dxa" w:w="1049"/>
             <w:vAlign w:val="center"/>
           </w:tcPr>
           <w:p>
@@ -6955,7 +6948,7 @@
         </w:tc>
         <w:tc>
           <w:tcPr>
-            <w:tcW w:type="dxa" w:w="1037"/>
+            <w:tcW w:type="dxa" w:w="1049"/>
             <w:vAlign w:val="center"/>
           </w:tcPr>
           <w:p>
@@ -6971,7 +6964,7 @@
         </w:tc>
         <w:tc>
           <w:tcPr>
-            <w:tcW w:type="dxa" w:w="1037"/>
+            <w:tcW w:type="dxa" w:w="1049"/>
             <w:vAlign w:val="center"/>
           </w:tcPr>
           <w:p>
@@ -6987,7 +6980,7 @@
         </w:tc>
         <w:tc>
           <w:tcPr>
-            <w:tcW w:type="dxa" w:w="1037"/>
+            <w:tcW w:type="dxa" w:w="1049"/>
             <w:vAlign w:val="center"/>
           </w:tcPr>
           <w:p>
@@ -7003,7 +6996,7 @@
         </w:tc>
         <w:tc>
           <w:tcPr>
-            <w:tcW w:type="dxa" w:w="1037"/>
+            <w:tcW w:type="dxa" w:w="1049"/>
             <w:vAlign w:val="center"/>
           </w:tcPr>
           <w:p>
@@ -7019,7 +7012,7 @@
         </w:tc>
         <w:tc>
           <w:tcPr>
-            <w:tcW w:type="dxa" w:w="1037"/>
+            <w:tcW w:type="dxa" w:w="1049"/>
             <w:vAlign w:val="center"/>
           </w:tcPr>
           <w:p>
@@ -7035,7 +7028,7 @@
         </w:tc>
         <w:tc>
           <w:tcPr>
-            <w:tcW w:type="dxa" w:w="1037"/>
+            <w:tcW w:type="dxa" w:w="1049"/>
             <w:vAlign w:val="center"/>
           </w:tcPr>
           <w:p>
@@ -7051,7 +7044,7 @@
         </w:tc>
         <w:tc>
           <w:tcPr>
-            <w:tcW w:type="dxa" w:w="1037"/>
+            <w:tcW w:type="dxa" w:w="1049"/>
             <w:vAlign w:val="center"/>
           </w:tcPr>
           <w:p>
@@ -7067,7 +7060,7 @@
         </w:tc>
         <w:tc>
           <w:tcPr>
-            <w:tcW w:type="dxa" w:w="1037"/>
+            <w:tcW w:type="dxa" w:w="1049"/>
             <w:vAlign w:val="center"/>
           </w:tcPr>
           <w:p>
@@ -7083,7 +7076,7 @@
         </w:tc>
         <w:tc>
           <w:tcPr>
-            <w:tcW w:type="dxa" w:w="1037"/>
+            <w:tcW w:type="dxa" w:w="1531"/>
             <w:vAlign w:val="center"/>
           </w:tcPr>
           <w:p>
@@ -7104,7 +7097,7 @@
         </w:trPr>
         <w:tc>
           <w:tcPr>
-            <w:tcW w:type="dxa" w:w="2608"/>
+            <w:tcW w:type="dxa" w:w="2268"/>
             <w:vAlign w:val="center"/>
           </w:tcPr>
           <w:p>
@@ -7120,7 +7113,7 @@
         </w:tc>
         <w:tc>
           <w:tcPr>
-            <w:tcW w:type="dxa" w:w="1037"/>
+            <w:tcW w:type="dxa" w:w="1049"/>
             <w:vAlign w:val="center"/>
           </w:tcPr>
           <w:p>
@@ -7136,7 +7129,7 @@
         </w:tc>
         <w:tc>
           <w:tcPr>
-            <w:tcW w:type="dxa" w:w="1037"/>
+            <w:tcW w:type="dxa" w:w="1049"/>
             <w:vAlign w:val="center"/>
           </w:tcPr>
           <w:p>
@@ -7152,7 +7145,7 @@
         </w:tc>
         <w:tc>
           <w:tcPr>
-            <w:tcW w:type="dxa" w:w="1037"/>
+            <w:tcW w:type="dxa" w:w="1049"/>
             <w:vAlign w:val="center"/>
           </w:tcPr>
           <w:p>
@@ -7168,7 +7161,7 @@
         </w:tc>
         <w:tc>
           <w:tcPr>
-            <w:tcW w:type="dxa" w:w="1037"/>
+            <w:tcW w:type="dxa" w:w="1049"/>
             <w:vAlign w:val="center"/>
           </w:tcPr>
           <w:p>
@@ -7184,7 +7177,7 @@
         </w:tc>
         <w:tc>
           <w:tcPr>
-            <w:tcW w:type="dxa" w:w="1037"/>
+            <w:tcW w:type="dxa" w:w="1049"/>
             <w:vAlign w:val="center"/>
           </w:tcPr>
           <w:p>
@@ -7200,7 +7193,7 @@
         </w:tc>
         <w:tc>
           <w:tcPr>
-            <w:tcW w:type="dxa" w:w="1037"/>
+            <w:tcW w:type="dxa" w:w="1049"/>
             <w:vAlign w:val="center"/>
           </w:tcPr>
           <w:p>
@@ -7216,7 +7209,7 @@
         </w:tc>
         <w:tc>
           <w:tcPr>
-            <w:tcW w:type="dxa" w:w="1037"/>
+            <w:tcW w:type="dxa" w:w="1049"/>
             <w:vAlign w:val="center"/>
           </w:tcPr>
           <w:p>
@@ -7232,7 +7225,7 @@
         </w:tc>
         <w:tc>
           <w:tcPr>
-            <w:tcW w:type="dxa" w:w="1037"/>
+            <w:tcW w:type="dxa" w:w="1049"/>
             <w:vAlign w:val="center"/>
           </w:tcPr>
           <w:p>
@@ -7248,7 +7241,7 @@
         </w:tc>
         <w:tc>
           <w:tcPr>
-            <w:tcW w:type="dxa" w:w="1037"/>
+            <w:tcW w:type="dxa" w:w="1049"/>
             <w:vAlign w:val="center"/>
           </w:tcPr>
           <w:p>
@@ -7264,7 +7257,7 @@
         </w:tc>
         <w:tc>
           <w:tcPr>
-            <w:tcW w:type="dxa" w:w="1037"/>
+            <w:tcW w:type="dxa" w:w="1531"/>
             <w:vAlign w:val="center"/>
           </w:tcPr>
           <w:p>
@@ -7285,7 +7278,7 @@
         </w:trPr>
         <w:tc>
           <w:tcPr>
-            <w:tcW w:type="dxa" w:w="2608"/>
+            <w:tcW w:type="dxa" w:w="2268"/>
             <w:vAlign w:val="center"/>
           </w:tcPr>
           <w:p>
@@ -7301,7 +7294,7 @@
         </w:tc>
         <w:tc>
           <w:tcPr>
-            <w:tcW w:type="dxa" w:w="1037"/>
+            <w:tcW w:type="dxa" w:w="1049"/>
             <w:vAlign w:val="center"/>
           </w:tcPr>
           <w:p>
@@ -7317,7 +7310,7 @@
         </w:tc>
         <w:tc>
           <w:tcPr>
-            <w:tcW w:type="dxa" w:w="1037"/>
+            <w:tcW w:type="dxa" w:w="1049"/>
             <w:vAlign w:val="center"/>
           </w:tcPr>
           <w:p>
@@ -7333,7 +7326,7 @@
         </w:tc>
         <w:tc>
           <w:tcPr>
-            <w:tcW w:type="dxa" w:w="1037"/>
+            <w:tcW w:type="dxa" w:w="1049"/>
             <w:vAlign w:val="center"/>
           </w:tcPr>
           <w:p>
@@ -7349,7 +7342,7 @@
         </w:tc>
         <w:tc>
           <w:tcPr>
-            <w:tcW w:type="dxa" w:w="1037"/>
+            <w:tcW w:type="dxa" w:w="1049"/>
             <w:vAlign w:val="center"/>
           </w:tcPr>
           <w:p>
@@ -7365,7 +7358,7 @@
         </w:tc>
         <w:tc>
           <w:tcPr>
-            <w:tcW w:type="dxa" w:w="1037"/>
+            <w:tcW w:type="dxa" w:w="1049"/>
             <w:vAlign w:val="center"/>
           </w:tcPr>
           <w:p>
@@ -7381,7 +7374,7 @@
         </w:tc>
         <w:tc>
           <w:tcPr>
-            <w:tcW w:type="dxa" w:w="1037"/>
+            <w:tcW w:type="dxa" w:w="1049"/>
             <w:vAlign w:val="center"/>
           </w:tcPr>
           <w:p>
@@ -7397,7 +7390,7 @@
         </w:tc>
         <w:tc>
           <w:tcPr>
-            <w:tcW w:type="dxa" w:w="1037"/>
+            <w:tcW w:type="dxa" w:w="1049"/>
             <w:vAlign w:val="center"/>
           </w:tcPr>
           <w:p>
@@ -7413,7 +7406,7 @@
         </w:tc>
         <w:tc>
           <w:tcPr>
-            <w:tcW w:type="dxa" w:w="1037"/>
+            <w:tcW w:type="dxa" w:w="1049"/>
             <w:vAlign w:val="center"/>
           </w:tcPr>
           <w:p>
@@ -7429,7 +7422,7 @@
         </w:tc>
         <w:tc>
           <w:tcPr>
-            <w:tcW w:type="dxa" w:w="1037"/>
+            <w:tcW w:type="dxa" w:w="1049"/>
             <w:vAlign w:val="center"/>
           </w:tcPr>
           <w:p>
@@ -7445,7 +7438,7 @@
         </w:tc>
         <w:tc>
           <w:tcPr>
-            <w:tcW w:type="dxa" w:w="1037"/>
+            <w:tcW w:type="dxa" w:w="1531"/>
             <w:vAlign w:val="center"/>
           </w:tcPr>
           <w:p>
@@ -7971,6 +7964,19 @@
         <w:t>Anexo 7. Medidas para la resolución de PRM</w:t>
       </w:r>
     </w:p>
+    <w:p>
+      <w:pPr>
+        <w:jc w:val="both"/>
+      </w:pPr>
+      <w:r>
+        <w:rPr>
+          <w:rFonts w:ascii="Arial" w:hAnsi="Arial" w:cs="Arial"/>
+          <w:b w:val="0"/>
+          <w:sz w:val="22"/>
+        </w:rPr>
+        <w:t>La columna de la derecha indica quién ejecuta cada medida. El Químico Farmacéutico aplica de forma directa solo el ajuste de horarios y la educación; el resto de las medidas las conversa con el médico o las deja como sugerencia en la ficha clínica para que este las revise y dé su opinión.</w:t>
+      </w:r>
+    </w:p>
     <w:tbl>
       <w:tblPr>
         <w:tblStyle w:val="TableGrid"/>
@@ -7978,13 +7984,14 @@
         <w:tblLook w:firstColumn="1" w:firstRow="1" w:lastColumn="0" w:lastRow="0" w:noHBand="0" w:noVBand="1" w:val="04A0"/>
       </w:tblPr>
       <w:tblGrid>
-        <w:gridCol w:w="2551"/>
-        <w:gridCol w:w="6520"/>
+        <w:gridCol w:w="2154"/>
+        <w:gridCol w:w="4762"/>
+        <w:gridCol w:w="2154"/>
       </w:tblGrid>
       <w:tr>
         <w:tc>
           <w:tcPr>
-            <w:tcW w:type="dxa" w:w="4703"/>
+            <w:tcW w:type="dxa" w:w="3135"/>
             <w:vAlign w:val="center"/>
             <w:shd w:val="clear" w:color="auto" w:fill="D9D9D9"/>
           </w:tcPr>
@@ -8005,7 +8012,7 @@
         </w:tc>
         <w:tc>
           <w:tcPr>
-            <w:tcW w:type="dxa" w:w="4703"/>
+            <w:tcW w:type="dxa" w:w="3135"/>
             <w:vAlign w:val="center"/>
             <w:shd w:val="clear" w:color="auto" w:fill="D9D9D9"/>
           </w:tcPr>
@@ -8024,11 +8031,150 @@
             </w:r>
           </w:p>
         </w:tc>
+        <w:tc>
+          <w:tcPr>
+            <w:tcW w:type="dxa" w:w="3135"/>
+            <w:vAlign w:val="center"/>
+            <w:shd w:val="clear" w:color="auto" w:fill="D9D9D9"/>
+          </w:tcPr>
+          <w:p>
+            <w:pPr>
+              <w:jc w:val="center"/>
+            </w:pPr>
+            <w:r/>
+            <w:r>
+              <w:rPr>
+                <w:rFonts w:ascii="Arial" w:hAnsi="Arial" w:cs="Arial"/>
+                <w:b/>
+                <w:sz w:val="22"/>
+              </w:rPr>
+              <w:t>Quién la ejecuta</w:t>
+            </w:r>
+          </w:p>
+        </w:tc>
       </w:tr>
       <w:tr>
         <w:tc>
           <w:tcPr>
-            <w:tcW w:type="dxa" w:w="2551"/>
+            <w:tcW w:type="dxa" w:w="2154"/>
+            <w:vAlign w:val="center"/>
+          </w:tcPr>
+          <w:p>
+            <w:r/>
+            <w:r>
+              <w:rPr>
+                <w:rFonts w:ascii="Arial" w:hAnsi="Arial" w:cs="Arial"/>
+                <w:b/>
+                <w:sz w:val="22"/>
+              </w:rPr>
+              <w:t>Modificar el horario</w:t>
+            </w:r>
+          </w:p>
+        </w:tc>
+        <w:tc>
+          <w:tcPr>
+            <w:tcW w:type="dxa" w:w="4762"/>
+            <w:vAlign w:val="center"/>
+          </w:tcPr>
+          <w:p>
+            <w:pPr>
+              <w:jc w:val="both"/>
+            </w:pPr>
+            <w:r/>
+            <w:r>
+              <w:rPr>
+                <w:rFonts w:ascii="Arial" w:hAnsi="Arial" w:cs="Arial"/>
+                <w:b w:val="0"/>
+                <w:sz w:val="22"/>
+              </w:rPr>
+              <w:t>Cambio del horario de administración por uno más adecuado al medicamento y a la rutina del paciente.</w:t>
+            </w:r>
+          </w:p>
+        </w:tc>
+        <w:tc>
+          <w:tcPr>
+            <w:tcW w:type="dxa" w:w="2154"/>
+            <w:vAlign w:val="center"/>
+          </w:tcPr>
+          <w:p>
+            <w:pPr>
+              <w:jc w:val="center"/>
+            </w:pPr>
+            <w:r/>
+            <w:r>
+              <w:rPr>
+                <w:rFonts w:ascii="Arial" w:hAnsi="Arial" w:cs="Arial"/>
+                <w:b w:val="0"/>
+                <w:sz w:val="20"/>
+              </w:rPr>
+              <w:t>Directa del Q.F.</w:t>
+            </w:r>
+          </w:p>
+        </w:tc>
+      </w:tr>
+      <w:tr>
+        <w:tc>
+          <w:tcPr>
+            <w:tcW w:type="dxa" w:w="2154"/>
+            <w:vAlign w:val="center"/>
+          </w:tcPr>
+          <w:p>
+            <w:r/>
+            <w:r>
+              <w:rPr>
+                <w:rFonts w:ascii="Arial" w:hAnsi="Arial" w:cs="Arial"/>
+                <w:b/>
+                <w:sz w:val="22"/>
+              </w:rPr>
+              <w:t>Intervención educativa</w:t>
+            </w:r>
+          </w:p>
+        </w:tc>
+        <w:tc>
+          <w:tcPr>
+            <w:tcW w:type="dxa" w:w="4762"/>
+            <w:vAlign w:val="center"/>
+          </w:tcPr>
+          <w:p>
+            <w:pPr>
+              <w:jc w:val="both"/>
+            </w:pPr>
+            <w:r/>
+            <w:r>
+              <w:rPr>
+                <w:rFonts w:ascii="Arial" w:hAnsi="Arial" w:cs="Arial"/>
+                <w:b w:val="0"/>
+                <w:sz w:val="22"/>
+              </w:rPr>
+              <w:t>Educación al paciente, la familia o el cuidador para mejorar la adherencia y el uso correcto de los medicamentos.</w:t>
+            </w:r>
+          </w:p>
+        </w:tc>
+        <w:tc>
+          <w:tcPr>
+            <w:tcW w:type="dxa" w:w="2154"/>
+            <w:vAlign w:val="center"/>
+          </w:tcPr>
+          <w:p>
+            <w:pPr>
+              <w:jc w:val="center"/>
+            </w:pPr>
+            <w:r/>
+            <w:r>
+              <w:rPr>
+                <w:rFonts w:ascii="Arial" w:hAnsi="Arial" w:cs="Arial"/>
+                <w:b w:val="0"/>
+                <w:sz w:val="20"/>
+              </w:rPr>
+              <w:t>Directa del Q.F.</w:t>
+            </w:r>
+          </w:p>
+        </w:tc>
+      </w:tr>
+      <w:tr>
+        <w:tc>
+          <w:tcPr>
+            <w:tcW w:type="dxa" w:w="2154"/>
             <w:vAlign w:val="center"/>
           </w:tcPr>
           <w:p>
@@ -8045,7 +8191,7 @@
         </w:tc>
         <w:tc>
           <w:tcPr>
-            <w:tcW w:type="dxa" w:w="6520"/>
+            <w:tcW w:type="dxa" w:w="4762"/>
             <w:vAlign w:val="center"/>
           </w:tcPr>
           <w:p>
@@ -8063,11 +8209,31 @@
             </w:r>
           </w:p>
         </w:tc>
+        <w:tc>
+          <w:tcPr>
+            <w:tcW w:type="dxa" w:w="2154"/>
+            <w:vAlign w:val="center"/>
+          </w:tcPr>
+          <w:p>
+            <w:pPr>
+              <w:jc w:val="center"/>
+            </w:pPr>
+            <w:r/>
+            <w:r>
+              <w:rPr>
+                <w:rFonts w:ascii="Arial" w:hAnsi="Arial" w:cs="Arial"/>
+                <w:b w:val="0"/>
+                <w:sz w:val="20"/>
+              </w:rPr>
+              <w:t>Sugerencia al médico</w:t>
+            </w:r>
+          </w:p>
+        </w:tc>
       </w:tr>
       <w:tr>
         <w:tc>
           <w:tcPr>
-            <w:tcW w:type="dxa" w:w="2551"/>
+            <w:tcW w:type="dxa" w:w="2154"/>
             <w:vAlign w:val="center"/>
           </w:tcPr>
           <w:p>
@@ -8084,7 +8250,7 @@
         </w:tc>
         <w:tc>
           <w:tcPr>
-            <w:tcW w:type="dxa" w:w="6520"/>
+            <w:tcW w:type="dxa" w:w="4762"/>
             <w:vAlign w:val="center"/>
           </w:tcPr>
           <w:p>
@@ -8102,11 +8268,31 @@
             </w:r>
           </w:p>
         </w:tc>
+        <w:tc>
+          <w:tcPr>
+            <w:tcW w:type="dxa" w:w="2154"/>
+            <w:vAlign w:val="center"/>
+          </w:tcPr>
+          <w:p>
+            <w:pPr>
+              <w:jc w:val="center"/>
+            </w:pPr>
+            <w:r/>
+            <w:r>
+              <w:rPr>
+                <w:rFonts w:ascii="Arial" w:hAnsi="Arial" w:cs="Arial"/>
+                <w:b w:val="0"/>
+                <w:sz w:val="20"/>
+              </w:rPr>
+              <w:t>Sugerencia al médico</w:t>
+            </w:r>
+          </w:p>
+        </w:tc>
       </w:tr>
       <w:tr>
         <w:tc>
           <w:tcPr>
-            <w:tcW w:type="dxa" w:w="2551"/>
+            <w:tcW w:type="dxa" w:w="2154"/>
             <w:vAlign w:val="center"/>
           </w:tcPr>
           <w:p>
@@ -8123,7 +8309,7 @@
         </w:tc>
         <w:tc>
           <w:tcPr>
-            <w:tcW w:type="dxa" w:w="6520"/>
+            <w:tcW w:type="dxa" w:w="4762"/>
             <w:vAlign w:val="center"/>
           </w:tcPr>
           <w:p>
@@ -8141,11 +8327,31 @@
             </w:r>
           </w:p>
         </w:tc>
+        <w:tc>
+          <w:tcPr>
+            <w:tcW w:type="dxa" w:w="2154"/>
+            <w:vAlign w:val="center"/>
+          </w:tcPr>
+          <w:p>
+            <w:pPr>
+              <w:jc w:val="center"/>
+            </w:pPr>
+            <w:r/>
+            <w:r>
+              <w:rPr>
+                <w:rFonts w:ascii="Arial" w:hAnsi="Arial" w:cs="Arial"/>
+                <w:b w:val="0"/>
+                <w:sz w:val="20"/>
+              </w:rPr>
+              <w:t>Sugerencia al médico</w:t>
+            </w:r>
+          </w:p>
+        </w:tc>
       </w:tr>
       <w:tr>
         <w:tc>
           <w:tcPr>
-            <w:tcW w:type="dxa" w:w="2551"/>
+            <w:tcW w:type="dxa" w:w="2154"/>
             <w:vAlign w:val="center"/>
           </w:tcPr>
           <w:p>
@@ -8162,7 +8368,7 @@
         </w:tc>
         <w:tc>
           <w:tcPr>
-            <w:tcW w:type="dxa" w:w="6520"/>
+            <w:tcW w:type="dxa" w:w="4762"/>
             <w:vAlign w:val="center"/>
           </w:tcPr>
           <w:p>
@@ -8180,11 +8386,31 @@
             </w:r>
           </w:p>
         </w:tc>
+        <w:tc>
+          <w:tcPr>
+            <w:tcW w:type="dxa" w:w="2154"/>
+            <w:vAlign w:val="center"/>
+          </w:tcPr>
+          <w:p>
+            <w:pPr>
+              <w:jc w:val="center"/>
+            </w:pPr>
+            <w:r/>
+            <w:r>
+              <w:rPr>
+                <w:rFonts w:ascii="Arial" w:hAnsi="Arial" w:cs="Arial"/>
+                <w:b w:val="0"/>
+                <w:sz w:val="20"/>
+              </w:rPr>
+              <w:t>Sugerencia al médico</w:t>
+            </w:r>
+          </w:p>
+        </w:tc>
       </w:tr>
       <w:tr>
         <w:tc>
           <w:tcPr>
-            <w:tcW w:type="dxa" w:w="2551"/>
+            <w:tcW w:type="dxa" w:w="2154"/>
             <w:vAlign w:val="center"/>
           </w:tcPr>
           <w:p>
@@ -8201,7 +8427,7 @@
         </w:tc>
         <w:tc>
           <w:tcPr>
-            <w:tcW w:type="dxa" w:w="6520"/>
+            <w:tcW w:type="dxa" w:w="4762"/>
             <w:vAlign w:val="center"/>
           </w:tcPr>
           <w:p>
@@ -8219,99 +8445,28 @@
             </w:r>
           </w:p>
         </w:tc>
-      </w:tr>
-      <w:tr>
         <w:tc>
           <w:tcPr>
-            <w:tcW w:type="dxa" w:w="2551"/>
-            <w:vAlign w:val="center"/>
-          </w:tcPr>
-          <w:p>
-            <w:r/>
-            <w:r>
-              <w:rPr>
-                <w:rFonts w:ascii="Arial" w:hAnsi="Arial" w:cs="Arial"/>
-                <w:b/>
-                <w:sz w:val="22"/>
-              </w:rPr>
-              <w:t>Modificar el horario</w:t>
-            </w:r>
-          </w:p>
-        </w:tc>
-        <w:tc>
-          <w:tcPr>
-            <w:tcW w:type="dxa" w:w="6520"/>
+            <w:tcW w:type="dxa" w:w="2154"/>
             <w:vAlign w:val="center"/>
           </w:tcPr>
           <w:p>
             <w:pPr>
-              <w:jc w:val="both"/>
+              <w:jc w:val="center"/>
             </w:pPr>
             <w:r/>
             <w:r>
               <w:rPr>
                 <w:rFonts w:ascii="Arial" w:hAnsi="Arial" w:cs="Arial"/>
                 <w:b w:val="0"/>
-                <w:sz w:val="22"/>
+                <w:sz w:val="20"/>
               </w:rPr>
-              <w:t>Cambio del horario de administración por uno más adecuado al medicamento y a la rutina del paciente.</w:t>
-            </w:r>
-          </w:p>
-        </w:tc>
-      </w:tr>
-      <w:tr>
-        <w:tc>
-          <w:tcPr>
-            <w:tcW w:type="dxa" w:w="2551"/>
-            <w:vAlign w:val="center"/>
-          </w:tcPr>
-          <w:p>
-            <w:r/>
-            <w:r>
-              <w:rPr>
-                <w:rFonts w:ascii="Arial" w:hAnsi="Arial" w:cs="Arial"/>
-                <w:b/>
-                <w:sz w:val="22"/>
-              </w:rPr>
-              <w:t>Intervención educativa</w:t>
-            </w:r>
-          </w:p>
-        </w:tc>
-        <w:tc>
-          <w:tcPr>
-            <w:tcW w:type="dxa" w:w="6520"/>
-            <w:vAlign w:val="center"/>
-          </w:tcPr>
-          <w:p>
-            <w:pPr>
-              <w:jc w:val="both"/>
-            </w:pPr>
-            <w:r/>
-            <w:r>
-              <w:rPr>
-                <w:rFonts w:ascii="Arial" w:hAnsi="Arial" w:cs="Arial"/>
-                <w:b w:val="0"/>
-                <w:sz w:val="22"/>
-              </w:rPr>
-              <w:t>Educación al paciente, la familia o el cuidador para mejorar la adherencia y el uso correcto de los medicamentos.</w:t>
+              <w:t>Sugerencia al médico</w:t>
             </w:r>
           </w:p>
         </w:tc>
       </w:tr>
     </w:tbl>
-    <w:p>
-      <w:pPr>
-        <w:jc w:val="both"/>
-      </w:pPr>
-      <w:r>
-        <w:rPr>
-          <w:rFonts w:ascii="Arial" w:hAnsi="Arial" w:cs="Arial"/>
-          <w:b w:val="0"/>
-          <w:sz w:val="22"/>
-        </w:rPr>
-        <w:t>La sugerencia se deja siempre registrada en la ficha clínica para el médico que corresponda.</w:t>
-      </w:r>
-    </w:p>
     <w:p>
       <w:pPr>
         <w:keepNext/>
@@ -8340,40 +8495,68 @@
         <w:t>Instrumento breve que evalúa el grado de conocimiento que el paciente tiene sobre su enfermedad. Se aplica como complemento del test de adherencia.</w:t>
       </w:r>
     </w:p>
-    <w:p>
-      <w:r>
-        <w:rPr>
-          <w:rFonts w:ascii="Arial" w:hAnsi="Arial" w:cs="Arial"/>
-          <w:b/>
-          <w:sz w:val="22"/>
-        </w:rPr>
-        <w:t xml:space="preserve">Nombre del paciente: </w:t>
-      </w:r>
-      <w:r>
-        <w:rPr>
-          <w:rFonts w:ascii="Arial" w:hAnsi="Arial" w:cs="Arial"/>
-          <w:b w:val="0"/>
-          <w:sz w:val="22"/>
-        </w:rPr>
-        <w:t xml:space="preserve">___________________________________   </w:t>
-      </w:r>
-      <w:r>
-        <w:rPr>
-          <w:rFonts w:ascii="Arial" w:hAnsi="Arial" w:cs="Arial"/>
-          <w:b/>
-          <w:sz w:val="22"/>
-        </w:rPr>
-        <w:t xml:space="preserve">Fecha: </w:t>
-      </w:r>
-      <w:r>
-        <w:rPr>
-          <w:rFonts w:ascii="Arial" w:hAnsi="Arial" w:cs="Arial"/>
-          <w:b w:val="0"/>
-          <w:sz w:val="22"/>
-        </w:rPr>
-        <w:t>____________</w:t>
-      </w:r>
-    </w:p>
+    <w:tbl>
+      <w:tblPr>
+        <w:tblStyle w:val="TableGrid"/>
+        <w:tblW w:type="auto" w:w="0"/>
+        <w:jc w:val="center"/>
+        <w:tblLook w:firstColumn="1" w:firstRow="1" w:lastColumn="0" w:lastRow="0" w:noHBand="0" w:noVBand="1" w:val="04A0"/>
+      </w:tblPr>
+      <w:tblGrid>
+        <w:gridCol w:w="4703"/>
+        <w:gridCol w:w="4703"/>
+      </w:tblGrid>
+      <w:tr>
+        <w:tc>
+          <w:tcPr>
+            <w:tcW w:type="dxa" w:w="4703"/>
+          </w:tcPr>
+          <w:p>
+            <w:r/>
+            <w:r>
+              <w:rPr>
+                <w:rFonts w:ascii="Arial" w:hAnsi="Arial" w:cs="Arial"/>
+                <w:b/>
+                <w:sz w:val="20"/>
+              </w:rPr>
+              <w:t>Nombre del paciente:</w:t>
+            </w:r>
+            <w:r>
+              <w:rPr>
+                <w:rFonts w:ascii="Arial" w:hAnsi="Arial" w:cs="Arial"/>
+                <w:b w:val="0"/>
+                <w:sz w:val="20"/>
+              </w:rPr>
+              <w:t xml:space="preserve">  </w:t>
+            </w:r>
+          </w:p>
+        </w:tc>
+        <w:tc>
+          <w:tcPr>
+            <w:tcW w:type="dxa" w:w="4703"/>
+          </w:tcPr>
+          <w:p>
+            <w:r/>
+            <w:r>
+              <w:rPr>
+                <w:rFonts w:ascii="Arial" w:hAnsi="Arial" w:cs="Arial"/>
+                <w:b/>
+                <w:sz w:val="20"/>
+              </w:rPr>
+              <w:t>Fecha:</w:t>
+            </w:r>
+            <w:r>
+              <w:rPr>
+                <w:rFonts w:ascii="Arial" w:hAnsi="Arial" w:cs="Arial"/>
+                <w:b w:val="0"/>
+                <w:sz w:val="20"/>
+              </w:rPr>
+              <w:t xml:space="preserve">  </w:t>
+            </w:r>
+          </w:p>
+        </w:tc>
+      </w:tr>
+    </w:tbl>
     <w:p/>
     <w:tbl>
       <w:tblPr>
@@ -8730,7 +8913,7 @@
           <w:b/>
           <w:sz w:val="24"/>
         </w:rPr>
-        <w:t>13.- HISTORIAL DE REVISIONES</w:t>
+        <w:t>12.- HISTORIAL DE REVISIONES</w:t>
       </w:r>
     </w:p>
     <w:tbl>
@@ -8937,17 +9120,20 @@
     <w:tblPr>
       <w:tblStyle w:val="TableGrid"/>
       <w:tblW w:type="auto" w:w="0"/>
+      <w:jc w:val="center"/>
       <w:tblLayout w:type="fixed"/>
       <w:tblLook w:firstColumn="1" w:firstRow="1" w:lastColumn="0" w:lastRow="0" w:noHBand="0" w:noVBand="1" w:val="04A0"/>
     </w:tblPr>
     <w:tblGrid>
-      <w:gridCol w:w="3118"/>
-      <w:gridCol w:w="5953"/>
+      <w:gridCol w:w="1701"/>
+      <w:gridCol w:w="5386"/>
+      <w:gridCol w:w="2268"/>
     </w:tblGrid>
     <w:tr>
       <w:tc>
         <w:tcPr>
-          <w:tcW w:type="dxa" w:w="4535"/>
+          <w:tcW w:type="dxa" w:w="3118"/>
+          <w:vAlign w:val="center"/>
         </w:tcPr>
         <w:p>
           <w:pPr>
@@ -8989,6 +9175,26 @@
             </w:drawing>
           </w:r>
         </w:p>
+      </w:tc>
+      <w:tc>
+        <w:tcPr>
+          <w:tcW w:type="dxa" w:w="3118"/>
+          <w:vAlign w:val="center"/>
+        </w:tcPr>
+        <w:p>
+          <w:pPr>
+            <w:jc w:val="center"/>
+          </w:pPr>
+          <w:r/>
+          <w:r>
+            <w:rPr>
+              <w:rFonts w:ascii="Arial" w:hAnsi="Arial" w:cs="Arial"/>
+              <w:b/>
+              <w:sz w:val="20"/>
+            </w:rPr>
+            <w:t>CENTRO DE SALUD FAMILIAR VILLA NONGUÉN</w:t>
+          </w:r>
+        </w:p>
         <w:p>
           <w:pPr>
             <w:jc w:val="center"/>
@@ -8997,23 +9203,27 @@
             <w:rPr>
               <w:rFonts w:ascii="Arial" w:hAnsi="Arial" w:cs="Arial"/>
               <w:b/>
-              <w:sz w:val="16"/>
+              <w:sz w:val="17"/>
             </w:rPr>
-            <w:t>Centro de Salud Familiar Villa Nonguén</w:t>
+            <w:t>PROTOCOLO DE ATENCIÓN FARMACÉUTICA DOMICILIARIA EN EL PROGRAMA DE SALUD CARDIOVASCULAR</w:t>
           </w:r>
         </w:p>
       </w:tc>
       <w:tc>
         <w:tcPr>
-          <w:tcW w:type="dxa" w:w="4535"/>
+          <w:tcW w:type="dxa" w:w="3118"/>
+          <w:vAlign w:val="center"/>
         </w:tcPr>
         <w:p>
+          <w:pPr>
+            <w:spacing w:after="0"/>
+          </w:pPr>
           <w:r/>
           <w:r>
             <w:rPr>
               <w:rFonts w:ascii="Arial" w:hAnsi="Arial" w:cs="Arial"/>
-              <w:b w:val="0"/>
-              <w:sz w:val="20"/>
+              <w:b/>
+              <w:sz w:val="17"/>
             </w:rPr>
             <w:t xml:space="preserve">Código: </w:t>
           </w:r>
@@ -9021,17 +9231,20 @@
             <w:rPr>
               <w:rFonts w:ascii="Arial" w:hAnsi="Arial" w:cs="Arial"/>
               <w:b w:val="0"/>
-              <w:sz w:val="20"/>
+              <w:sz w:val="17"/>
             </w:rPr>
             <w:t>APF 1.5.1</w:t>
           </w:r>
         </w:p>
         <w:p>
+          <w:pPr>
+            <w:spacing w:after="0"/>
+          </w:pPr>
           <w:r>
             <w:rPr>
               <w:rFonts w:ascii="Arial" w:hAnsi="Arial" w:cs="Arial"/>
-              <w:b w:val="0"/>
-              <w:sz w:val="20"/>
+              <w:b/>
+              <w:sz w:val="17"/>
             </w:rPr>
             <w:t xml:space="preserve">Edición: </w:t>
           </w:r>
@@ -9039,35 +9252,41 @@
             <w:rPr>
               <w:rFonts w:ascii="Arial" w:hAnsi="Arial" w:cs="Arial"/>
               <w:b w:val="0"/>
-              <w:sz w:val="20"/>
+              <w:sz w:val="17"/>
             </w:rPr>
             <w:t>01</w:t>
           </w:r>
         </w:p>
         <w:p>
+          <w:pPr>
+            <w:spacing w:after="0"/>
+          </w:pPr>
           <w:r>
             <w:rPr>
               <w:rFonts w:ascii="Arial" w:hAnsi="Arial" w:cs="Arial"/>
-              <w:b w:val="0"/>
-              <w:sz w:val="20"/>
+              <w:b/>
+              <w:sz w:val="17"/>
             </w:rPr>
-            <w:t xml:space="preserve">Fecha Elab: </w:t>
+            <w:t xml:space="preserve">Fecha Elab.: </w:t>
           </w:r>
           <w:r>
             <w:rPr>
               <w:rFonts w:ascii="Arial" w:hAnsi="Arial" w:cs="Arial"/>
               <w:b w:val="0"/>
-              <w:sz w:val="20"/>
+              <w:sz w:val="17"/>
             </w:rPr>
             <w:t>Julio 2026</w:t>
           </w:r>
         </w:p>
         <w:p>
+          <w:pPr>
+            <w:spacing w:after="0"/>
+          </w:pPr>
           <w:r>
             <w:rPr>
               <w:rFonts w:ascii="Arial" w:hAnsi="Arial" w:cs="Arial"/>
-              <w:b w:val="0"/>
-              <w:sz w:val="20"/>
+              <w:b/>
+              <w:sz w:val="17"/>
             </w:rPr>
             <w:t xml:space="preserve">Página </w:t>
           </w:r>
@@ -9075,7 +9294,7 @@
             <w:rPr>
               <w:rFonts w:ascii="Arial" w:hAnsi="Arial" w:cs="Arial"/>
               <w:b w:val="0"/>
-              <w:sz w:val="20"/>
+              <w:sz w:val="17"/>
             </w:rPr>
             <w:fldChar w:fldCharType="begin"/>
             <w:instrText xml:space="preserve"> PAGE </w:instrText>
@@ -9085,7 +9304,7 @@
             <w:rPr>
               <w:rFonts w:ascii="Arial" w:hAnsi="Arial" w:cs="Arial"/>
               <w:b w:val="0"/>
-              <w:sz w:val="20"/>
+              <w:sz w:val="17"/>
             </w:rPr>
             <w:t xml:space="preserve"> de </w:t>
           </w:r>
@@ -9093,7 +9312,7 @@
             <w:rPr>
               <w:rFonts w:ascii="Arial" w:hAnsi="Arial" w:cs="Arial"/>
               <w:b w:val="0"/>
-              <w:sz w:val="20"/>
+              <w:sz w:val="17"/>
             </w:rPr>
             <w:fldChar w:fldCharType="begin"/>
             <w:instrText xml:space="preserve"> NUMPAGES </w:instrText>
@@ -9101,11 +9320,14 @@
           </w:r>
         </w:p>
         <w:p>
+          <w:pPr>
+            <w:spacing w:after="0"/>
+          </w:pPr>
           <w:r>
             <w:rPr>
               <w:rFonts w:ascii="Arial" w:hAnsi="Arial" w:cs="Arial"/>
-              <w:b w:val="0"/>
-              <w:sz w:val="20"/>
+              <w:b/>
+              <w:sz w:val="17"/>
             </w:rPr>
             <w:t xml:space="preserve">Vigencia: </w:t>
           </w:r>
@@ -9113,7 +9335,7 @@
             <w:rPr>
               <w:rFonts w:ascii="Arial" w:hAnsi="Arial" w:cs="Arial"/>
               <w:b w:val="0"/>
-              <w:sz w:val="20"/>
+              <w:sz w:val="17"/>
             </w:rPr>
             <w:t>Julio 2031</w:t>
           </w:r>
@@ -9121,19 +9343,6 @@
       </w:tc>
     </w:tr>
   </w:tbl>
-  <w:p>
-    <w:pPr>
-      <w:jc w:val="center"/>
-    </w:pPr>
-    <w:r>
-      <w:rPr>
-        <w:rFonts w:ascii="Arial" w:hAnsi="Arial" w:cs="Arial"/>
-        <w:b/>
-        <w:sz w:val="18"/>
-      </w:rPr>
-      <w:t>PROTOCOLO DE ATENCIÓN FARMACÉUTICA DOMICILIARIA EN EL PROGRAMA DE SALUD CARDIOVASCULAR</w:t>
-    </w:r>
-  </w:p>
 </w:hdr>
 </file>
 

</xml_diff>